<commit_message>
Actualizar a 22 estaciones reales y agregar Anexos A/B/C con specs tecnicas
</commit_message>
<xml_diff>
--- a/SARQUE_documento.docx
+++ b/SARQUE_documento.docx
@@ -514,6 +514,42 @@
         <w:t xml:space="preserve">BIBLIOGRAFÍA</w:t>
       </w:r>
     </w:p>
+    <w:p>
+      <w:pPr>
+        <w:numPr>
+          <w:ilvl w:val="0"/>
+          <w:numId w:val="1001"/>
+        </w:numPr>
+        <w:pStyle w:val="Compact"/>
+      </w:pPr>
+      <w:r>
+        <w:t xml:space="preserve">ANEXO A — ESPECIFICACIONES TÉCNICAS DETALLADAS</w:t>
+      </w:r>
+    </w:p>
+    <w:p>
+      <w:pPr>
+        <w:numPr>
+          <w:ilvl w:val="0"/>
+          <w:numId w:val="1001"/>
+        </w:numPr>
+        <w:pStyle w:val="Compact"/>
+      </w:pPr>
+      <w:r>
+        <w:t xml:space="preserve">ANEXO B — GALERÍA FOTOGRÁFICA DE LA INSTALACIÓN</w:t>
+      </w:r>
+    </w:p>
+    <w:p>
+      <w:pPr>
+        <w:numPr>
+          <w:ilvl w:val="0"/>
+          <w:numId w:val="1001"/>
+        </w:numPr>
+        <w:pStyle w:val="Compact"/>
+      </w:pPr>
+      <w:r>
+        <w:t xml:space="preserve">ANEXO C — CONFIGURACIÓN INICIAL DE LOS CONTROLADORES</w:t>
+      </w:r>
+    </w:p>
     <w:bookmarkEnd w:id="22"/>
     <w:bookmarkStart w:id="23" w:name="índice-de-figuras"/>
     <w:p>
@@ -636,7 +672,7 @@
         <w:pStyle w:val="FirstParagraph"/>
       </w:pPr>
       <w:r>
-        <w:t xml:space="preserve">SARQUE es un sistema de automatización y monitoreo de riego desarrollado para el Parque Ecoturístico Quinta Estación, un espacio verde de 5 hectáreas ubicado en Cochabamba, Bolivia, con más de 20 sectores de vegetación diferenciada. El sistema integra controladores de riego Bluetooth K-Rain BL-KR con electroválvulas de 9 V DC de acción latente, reemplazando el control manual de 41 llaves de paso distribuidas en el parque por un conjunto de 6 controladores programados que operan según un cronograma semanal predefinido. Un nodo ESP32 actúa como puente BLE-WiFi, capturando los eventos de activación y desactivación de electroválvulas mediante el protocolo Bluetooth Low Energy (BLE) y transmitiéndolos a la plataforma en la nube Supabase. Una aplicación web desarrollada en React + TypeScript expone historial de riegos, estadísticas de consumo hídrico, programación de horarios y estado en tiempo real de cada controlador, permitiendo a la administración del parque gestionar el riego sin necesidad de desplazamientos físicos a campo. El prototipo funcional valida la integración entre el controlador BL-KR2, el nodo ESP32 y la plataforma web, demostrando la viabilidad técnica del sistema para su escalado a los 6 controladores y 41 estaciones del parque completo. El costo operativo se reduce al eliminar el tiempo de caminata diaria del personal (mínimo 30 minutos por jornada) y al prevenir las fugas y el mal riego causados por el olvido en la apertura o cierre de llaves de paso.</w:t>
+        <w:t xml:space="preserve">SARQUE es un sistema de automatización y monitoreo de riego desarrollado para el Parque Ecoturístico Quinta Estación, un espacio verde de 5 hectáreas ubicado en Cochabamba, Bolivia, con más de 20 sectores de vegetación diferenciada. El sistema integra controladores de riego Bluetooth K-Rain BL-KR con electroválvulas de 9 V DC de acción latente, reemplazando el control manual de 22 electroválvulas (que centralizan el control de la red original de 41 puntos) distribuidas en el parque por un conjunto de 6 controladores programados que operan según un cronograma semanal predefinido. Un nodo ESP32 actúa como puente BLE-WiFi, capturando los eventos de activación y desactivación de electroválvulas mediante el protocolo Bluetooth Low Energy (BLE) y transmitiéndolos a la plataforma en la nube Supabase. Una aplicación web desarrollada en React + TypeScript expone historial de riegos, estadísticas de consumo hídrico, programación de horarios y estado en tiempo real de cada controlador, permitiendo a la administración del parque gestionar el riego sin necesidad de desplazamientos físicos a campo. El prototipo funcional valida la integración entre el controlador BL-KR2, el nodo ESP32 y la plataforma web, demostrando la viabilidad técnica del sistema para su escalado a los 6 controladores y 22 estaciones del parque completo. El costo operativo se reduce al eliminar el tiempo de caminata diaria del personal (mínimo 30 minutos por jornada) y al prevenir las fugas y el mal riego causados por el olvido en la apertura o cierre de llaves de paso.</w:t>
       </w:r>
     </w:p>
     <w:p>
@@ -694,7 +730,7 @@
         <w:pStyle w:val="BodyText"/>
       </w:pPr>
       <w:r>
-        <w:t xml:space="preserve">El presente Trabajo de Grado describe el diseño, desarrollo e implementación de SARQUE, un sistema que integra controladores de riego Bluetooth K-Rain BL-KR, electroválvulas de 9 V DC de acción latente, un nodo de monitoreo basado en ESP32 con conectividad WiFi, y una aplicación web de gestión desarrollada en React + TypeScript con backend en Supabase. El sistema automatiza la apertura y cierre de las 41 estaciones de riego del parque conforme a un cronograma semanal programado y genera reportes históricos de consumo hídrico para la toma de decisiones administrativas.</w:t>
+        <w:t xml:space="preserve">El presente Trabajo de Grado describe el diseño, desarrollo e implementación de SARQUE, un sistema que integra controladores de riego Bluetooth K-Rain BL-KR, electroválvulas de 9 V DC de acción latente, un nodo de monitoreo basado en ESP32 con conectividad WiFi, y una aplicación web de gestión desarrollada en React + TypeScript con backend en Supabase. El sistema automatiza la apertura y cierre de las 22 estaciones de riego del parque conforme a un cronograma semanal programado y genera reportes históricos de consumo hídrico para la toma de decisiones administrativas.</w:t>
       </w:r>
     </w:p>
     <w:p>
@@ -901,7 +937,7 @@
         <w:pStyle w:val="BodyText"/>
       </w:pPr>
       <w:r>
-        <w:t xml:space="preserve">El parque emplea a 6 jardineros y 1 administrador, bajo la dirección de la propietaria. El sistema de riego actual funciona mediante una bomba de agua de pozo con un caudal medido de 4.2 litros por segundo, capaz de mantener activa una sola zona de riego a la vez. El agua se distribuye a través de una red de cañerías que alimenta 41 llaves de paso manuales distribuidas en el predio —representadas en el Plano General a escala 1:250 como puntos de color dorado—, cada una de las cuales debe ser abierta y cerrada manualmente por el personal en cada ciclo de riego.</w:t>
+        <w:t xml:space="preserve">El parque emplea a 6 jardineros y 1 administrador, bajo la dirección de la propietaria. El sistema de riego actual funciona mediante una bomba de agua de pozo con un caudal medido de 4.2 litros por segundo, capaz de mantener activa una sola zona de riego a la vez. El agua se distribuye a través de una red de cañerías que alimenta 22 electroválvulas distribuidas estratégicamente sobre una red original de 41 puntos de riego distribuidas en el predio —representadas en el Plano General a escala 1:250 como puntos de color dorado—, cada una de las cuales debe ser abierta y cerrada manualmente por el personal en cada ciclo de riego.</w:t>
       </w:r>
     </w:p>
     <w:p>
@@ -1044,7 +1080,7 @@
         <w:t xml:space="preserve"> </w:t>
       </w:r>
       <w:r>
-        <w:t xml:space="preserve">Un olvido de apertura o cierre de llave de paso puede ocurrir en cualquiera de los 41 puntos del parque. Con 6 sectores diarios a gestionar en promedio, la probabilidad de error manual en un sistema completamente dependiente de la memoria humana es estadísticamente significativa. SARQUE reemplaza la decisión manual por una programación automática en los controladores BL-KR, garantizando que cada electroválvula se abra y cierre en el horario exacto configurado, independientemente de la presencia o atención del jardinero.</w:t>
+        <w:t xml:space="preserve">Un olvido de apertura o cierre de llave de paso puede ocurrir en cualquiera de los 22 puntos del parque. Con 6 sectores diarios a gestionar en promedio, la probabilidad de error manual en un sistema completamente dependiente de la memoria humana es estadísticamente significativa. SARQUE reemplaza la decisión manual por una programación automática en los controladores BL-KR, garantizando que cada electroválvula se abra y cierre en el horario exacto configurado, independientemente de la presencia o atención del jardinero.</w:t>
       </w:r>
     </w:p>
     <w:p>
@@ -1321,7 +1357,7 @@
               <w:jc w:val="left"/>
             </w:pPr>
             <w:r>
-              <w:t xml:space="preserve">Porque no existe un sistema de automatización para las 41 estaciones del parque</w:t>
+              <w:t xml:space="preserve">Porque no existe un sistema de automatización para las 22 estaciones del parque</w:t>
             </w:r>
           </w:p>
         </w:tc>
@@ -1434,7 +1470,7 @@
         <w:t xml:space="preserve"> </w:t>
       </w:r>
       <w:r>
-        <w:t xml:space="preserve">Control de riego manual con 41 llaves de paso distribuidas en 5 hectáreas</w:t>
+        <w:t xml:space="preserve">Control de riego manual con 22 electroválvulas (que centralizan el control de la red original de 41 puntos) distribuidas en 5 hectáreas</w:t>
       </w:r>
     </w:p>
     <w:p>
@@ -1653,7 +1689,7 @@
         </w:numPr>
       </w:pPr>
       <w:r>
-        <w:t xml:space="preserve">Diseñar la arquitectura del sistema SARQUE, definiendo la distribución de los 6 controladores K-Rain BL-KR, las 41 estaciones de electroválvulas, el nodo ESP32 como puente BLE-WiFi y la plataforma Supabase como backend de datos.</w:t>
+        <w:t xml:space="preserve">Diseñar la arquitectura del sistema SARQUE, definiendo la distribución de los 6 controladores K-Rain BL-KR, las 22 estaciones de electroválvulas, el nodo ESP32 como puente BLE-WiFi y la plataforma Supabase como backend de datos.</w:t>
       </w:r>
     </w:p>
     <w:p>
@@ -3205,19 +3241,19 @@
         <w:pStyle w:val="BodyText"/>
       </w:pPr>
       <w:r>
-        <w:t xml:space="preserve">En SARQUE se utilizan 6 controladores BL-KR distribuidos en el parque:</w:t>
+        <w:t xml:space="preserve">En SARQUE se utilizan 6 controladores BL-KR distribuidos en el parque, seleccionados de modo que el cable monofilar 20 AWG entre cada controlador y su electroválvula más lejana no supere los 30 metros (optimización de cableado):</w:t>
       </w:r>
       <w:r>
         <w:t xml:space="preserve"> </w:t>
       </w:r>
       <w:r>
-        <w:t xml:space="preserve">- 3 unidades BL-KR9 (9 estaciones cada una): 27 estaciones</w:t>
+        <w:t xml:space="preserve">- 2 unidades BL-KR2 (2 estaciones cada una): 4 estaciones</w:t>
       </w:r>
       <w:r>
         <w:t xml:space="preserve"> </w:t>
       </w:r>
       <w:r>
-        <w:t xml:space="preserve">- 2 unidades BL-KR4 (4 estaciones cada una): 8 estaciones</w:t>
+        <w:t xml:space="preserve">- 3 unidades BL-KR4 (4 estaciones cada una): 12 estaciones</w:t>
       </w:r>
       <w:r>
         <w:t xml:space="preserve"> </w:t>
@@ -3239,7 +3275,7 @@
           <w:bCs/>
           <w:b/>
         </w:rPr>
-        <w:t xml:space="preserve">Total: 41 estaciones de riego automatizadas</w:t>
+        <w:t xml:space="preserve">Total: 22 estaciones de riego automatizadas</w:t>
       </w:r>
     </w:p>
     <w:p>
@@ -3316,7 +3352,7 @@
         <w:pStyle w:val="BodyText"/>
       </w:pPr>
       <w:r>
-        <w:t xml:space="preserve">En SARQUE, las electroválvulas K-Rain BSPT reemplazan las 41 llaves de paso manuales del parque, siendo actuadas por los controladores BL-KR según el cronograma de riego programado.</w:t>
+        <w:t xml:space="preserve">En SARQUE, las electroválvulas K-Rain BSPT reemplazan las 22 electroválvulas distribuidas estratégicamente sobre una red original de 41 puntos de riego del parque, siendo actuadas por los controladores BL-KR según el cronograma de riego programado.</w:t>
       </w:r>
     </w:p>
     <w:bookmarkEnd w:id="72"/>
@@ -6172,7 +6208,7 @@
               <w:jc w:val="left"/>
             </w:pPr>
             <w:r>
-              <w:t xml:space="preserve">Actuadores hídricos en las 41 estaciones</w:t>
+              <w:t xml:space="preserve">Actuadores hídricos en las 22 estaciones</w:t>
             </w:r>
           </w:p>
         </w:tc>
@@ -6664,14 +6700,14 @@
     <w:tbl>
       <w:tblPr>
         <w:tblStyle w:val="Table"/>
-        <w:tblW w:type="pct" w:w="5000"/>
+        <w:tblW w:type="auto" w:w="0"/>
         <w:tblLook w:firstRow="1" w:lastRow="0" w:firstColumn="0" w:lastColumn="0" w:noHBand="0" w:noVBand="0" w:val="0020"/>
         <w:jc w:val="start"/>
       </w:tblPr>
       <w:tblGrid>
-        <w:gridCol w:w="2132"/>
-        <w:gridCol w:w="1827"/>
-        <w:gridCol w:w="3960"/>
+        <w:gridCol w:w="2640"/>
+        <w:gridCol w:w="2640"/>
+        <w:gridCol w:w="2640"/>
       </w:tblGrid>
       <w:tr>
         <w:trPr>
@@ -6794,7 +6830,7 @@
               <w:t xml:space="preserve">“</w:t>
             </w:r>
             <w:r>
-              <w:t xml:space="preserve">BL-KR9 Norte</w:t>
+              <w:t xml:space="preserve">BL-KR6 Central</w:t>
             </w:r>
             <w:r>
               <w:t xml:space="preserve">”</w:t>
@@ -6838,7 +6874,7 @@
               <w:jc w:val="left"/>
             </w:pPr>
             <w:r>
-              <w:t xml:space="preserve">Modelo del controlador (BL-KR2, BL-KR4, BL-KR6, BL-KR9)</w:t>
+              <w:t xml:space="preserve">Modelo del controlador (BL-KR2, BL-KR4, BL-KR6)</w:t>
             </w:r>
           </w:p>
         </w:tc>
@@ -8739,7 +8775,7 @@
       <w:r>
         <w:drawing>
           <wp:inline>
-            <wp:extent cx="5334000" cy="2240406"/>
+            <wp:extent cx="5334000" cy="2403449"/>
             <wp:effectExtent b="0" l="0" r="0" t="0"/>
             <wp:docPr descr="Figura 4. Arquitectura General del Sistema SARQUE" title="" id="96" name="Picture"/>
             <a:graphic>
@@ -8760,7 +8796,7 @@
                   <pic:spPr bwMode="auto">
                     <a:xfrm>
                       <a:off x="0" y="0"/>
-                      <a:ext cx="5334000" cy="2240406"/>
+                      <a:ext cx="5334000" cy="2403449"/>
                     </a:xfrm>
                     <a:prstGeom prst="rect">
                       <a:avLst/>
@@ -8796,7 +8832,7 @@
           <w:iCs/>
           <w:i/>
         </w:rPr>
-        <w:t xml:space="preserve">Figura 4. Arquitectura General del Sistema SARQUE — distribución de 6 controladores BL-KR y 41 estaciones. Fuente: Elaboración propia, 2026.</w:t>
+        <w:t xml:space="preserve">Figura 4. Arquitectura General del Sistema SARQUE — distribución de 6 controladores BL-KR y 22 estaciones. Fuente: Elaboración propia, 2026.</w:t>
       </w:r>
     </w:p>
     <w:p>
@@ -14610,7 +14646,7 @@
         </w:numPr>
       </w:pPr>
       <w:r>
-        <w:t xml:space="preserve">El diagnóstico situacional del Parque Ecoturístico Quinta Estación confirmó que el control manual de 41 llaves de paso distribuidas en 5 hectáreas genera pérdidas operativas cuantificables: mínimo 30 minutos diarios en desplazamientos y riesgo de fugas o déficit hídrico por olvido en la apertura o cierre de llaves. El cronograma de riego semanal de alta complejidad —con entre 3 y 6 sectores diarios en franjas horarias rotativas— supera la capacidad de gestión confiable mediante memoria humana exclusivamente.</w:t>
+        <w:t xml:space="preserve">El diagnóstico situacional del Parque Ecoturístico Quinta Estación confirmó que el control manual de 22 electroválvulas (que centralizan el control de la red original de 41 puntos) distribuidas en 5 hectáreas genera pérdidas operativas cuantificables: mínimo 30 minutos diarios en desplazamientos y riesgo de fugas o déficit hídrico por olvido en la apertura o cierre de llaves. El cronograma de riego semanal de alta complejidad —con entre 3 y 6 sectores diarios en franjas horarias rotativas— supera la capacidad de gestión confiable mediante memoria humana exclusivamente.</w:t>
       </w:r>
     </w:p>
     <w:p>
@@ -14694,7 +14730,7 @@
         <w:t xml:space="preserve"> </w:t>
       </w:r>
       <w:r>
-        <w:t xml:space="preserve">El prototipo validado con el BL-KR2 debe extenderse a los 5 controladores adicionales (3× BL-KR9, 1× BL-KR4 adicional y el BL-KR6), ubicando nodos ESP32 adicionales en las zonas del parque donde la distancia BLE supere los 15 metros respecto al controlador más cercano.</w:t>
+        <w:t xml:space="preserve">El prototipo validado con un controlador BL-KR debe extenderse a los 5 controladores restantes (la otra unidad BL-KR2, las 3 unidades BL-KR4 y el BL-KR6), ubicando nodos ESP32 adicionales en las zonas del parque donde la distancia BLE supere los 15 metros respecto al controlador más cercano.</w:t>
       </w:r>
     </w:p>
     <w:p>
@@ -15404,30 +15440,2853 @@
         </w:pict>
       </w:r>
     </w:p>
+    <w:bookmarkEnd w:id="131"/>
+    <w:bookmarkEnd w:id="132"/>
+    <w:bookmarkStart w:id="151" w:name="anexos"/>
+    <w:p>
+      <w:pPr>
+        <w:pStyle w:val="Heading1"/>
+      </w:pPr>
+      <w:r>
+        <w:rPr>
+          <w:rStyle w:val="SectionNumber"/>
+        </w:rPr>
+        <w:t xml:space="preserve">7</w:t>
+      </w:r>
+      <w:r>
+        <w:tab/>
+      </w:r>
+      <w:r>
+        <w:t xml:space="preserve">ANEXOS</w:t>
+      </w:r>
+    </w:p>
+    <w:bookmarkStart w:id="139" w:name="Xd2c4611265eaeb0b04ce9818422372b8edd59d5"/>
+    <w:p>
+      <w:pPr>
+        <w:pStyle w:val="Heading2"/>
+      </w:pPr>
+      <w:r>
+        <w:rPr>
+          <w:rStyle w:val="SectionNumber"/>
+        </w:rPr>
+        <w:t xml:space="preserve">7.1</w:t>
+      </w:r>
+      <w:r>
+        <w:tab/>
+      </w:r>
+      <w:r>
+        <w:t xml:space="preserve">ANEXO A — ESPECIFICACIONES TÉCNICAS DETALLADAS DE LA INSTALACIÓN</w:t>
+      </w:r>
+    </w:p>
     <w:p>
       <w:pPr>
         <w:pStyle w:val="FirstParagraph"/>
+      </w:pPr>
+      <w:r>
+        <w:t xml:space="preserve">Este anexo recopila las especificaciones técnicas exactas de la instalación física del sistema SARQUE en el Parque Ecoturístico Quinta Estación, documentadas durante el trabajo de campo.</w:t>
+      </w:r>
+    </w:p>
+    <w:bookmarkStart w:id="133" w:name="a.1.-sistema-de-bombeo"/>
+    <w:p>
+      <w:pPr>
+        <w:pStyle w:val="Heading3"/>
+      </w:pPr>
+      <w:r>
+        <w:rPr>
+          <w:rStyle w:val="SectionNumber"/>
+        </w:rPr>
+        <w:t xml:space="preserve">7.1.1</w:t>
+      </w:r>
+      <w:r>
+        <w:tab/>
+      </w:r>
+      <w:r>
+        <w:t xml:space="preserve">A.1. Sistema de Bombeo</w:t>
+      </w:r>
+    </w:p>
+    <w:p>
+      <w:pPr>
+        <w:pStyle w:val="FirstParagraph"/>
+      </w:pPr>
+      <w:r>
+        <w:rPr>
+          <w:bCs/>
+          <w:b/>
+        </w:rPr>
+        <w:t xml:space="preserve">Tabla A.1. Especificaciones de la bomba de pozo</w:t>
+      </w:r>
+    </w:p>
+    <w:tbl>
+      <w:tblPr>
+        <w:tblStyle w:val="Table"/>
+        <w:tblW w:type="auto" w:w="0"/>
+        <w:tblLook w:firstRow="1" w:lastRow="0" w:firstColumn="0" w:lastColumn="0" w:noHBand="0" w:noVBand="0" w:val="0020"/>
+        <w:jc w:val="start"/>
+      </w:tblPr>
+      <w:tblGrid>
+        <w:gridCol w:w="3960"/>
+        <w:gridCol w:w="3960"/>
+      </w:tblGrid>
+      <w:tr>
+        <w:trPr>
+          <w:tblHeader w:val="true"/>
+        </w:trPr>
+        <w:tc>
+          <w:tcPr/>
+          <w:p>
+            <w:pPr>
+              <w:pStyle w:val="Compact"/>
+              <w:jc w:val="left"/>
+            </w:pPr>
+            <w:r>
+              <w:t xml:space="preserve">Parámetro</w:t>
+            </w:r>
+          </w:p>
+        </w:tc>
+        <w:tc>
+          <w:tcPr/>
+          <w:p>
+            <w:pPr>
+              <w:pStyle w:val="Compact"/>
+              <w:jc w:val="left"/>
+            </w:pPr>
+            <w:r>
+              <w:t xml:space="preserve">Valor</w:t>
+            </w:r>
+          </w:p>
+        </w:tc>
+      </w:tr>
+      <w:tr>
+        <w:tc>
+          <w:tcPr/>
+          <w:p>
+            <w:pPr>
+              <w:pStyle w:val="Compact"/>
+              <w:jc w:val="left"/>
+            </w:pPr>
+            <w:r>
+              <w:t xml:space="preserve">Marca</w:t>
+            </w:r>
+          </w:p>
+        </w:tc>
+        <w:tc>
+          <w:tcPr/>
+          <w:p>
+            <w:pPr>
+              <w:pStyle w:val="Compact"/>
+              <w:jc w:val="left"/>
+            </w:pPr>
+            <w:r>
+              <w:t xml:space="preserve">Grundfos</w:t>
+            </w:r>
+          </w:p>
+        </w:tc>
+      </w:tr>
+      <w:tr>
+        <w:tc>
+          <w:tcPr/>
+          <w:p>
+            <w:pPr>
+              <w:pStyle w:val="Compact"/>
+              <w:jc w:val="left"/>
+            </w:pPr>
+            <w:r>
+              <w:t xml:space="preserve">Tipo</w:t>
+            </w:r>
+          </w:p>
+        </w:tc>
+        <w:tc>
+          <w:tcPr/>
+          <w:p>
+            <w:pPr>
+              <w:pStyle w:val="Compact"/>
+              <w:jc w:val="left"/>
+            </w:pPr>
+            <w:r>
+              <w:t xml:space="preserve">Bomba sumergible</w:t>
+            </w:r>
+          </w:p>
+        </w:tc>
+      </w:tr>
+      <w:tr>
+        <w:tc>
+          <w:tcPr/>
+          <w:p>
+            <w:pPr>
+              <w:pStyle w:val="Compact"/>
+              <w:jc w:val="left"/>
+            </w:pPr>
+            <w:r>
+              <w:t xml:space="preserve">Potencia</w:t>
+            </w:r>
+          </w:p>
+        </w:tc>
+        <w:tc>
+          <w:tcPr/>
+          <w:p>
+            <w:pPr>
+              <w:pStyle w:val="Compact"/>
+              <w:jc w:val="left"/>
+            </w:pPr>
+            <w:r>
+              <w:t xml:space="preserve">5 HP (3.7 kW)</w:t>
+            </w:r>
+          </w:p>
+        </w:tc>
+      </w:tr>
+      <w:tr>
+        <w:tc>
+          <w:tcPr/>
+          <w:p>
+            <w:pPr>
+              <w:pStyle w:val="Compact"/>
+              <w:jc w:val="left"/>
+            </w:pPr>
+            <w:r>
+              <w:t xml:space="preserve">Alimentación eléctrica</w:t>
+            </w:r>
+          </w:p>
+        </w:tc>
+        <w:tc>
+          <w:tcPr/>
+          <w:p>
+            <w:pPr>
+              <w:pStyle w:val="Compact"/>
+              <w:jc w:val="left"/>
+            </w:pPr>
+            <w:r>
+              <w:t xml:space="preserve">Trifásica</w:t>
+            </w:r>
+          </w:p>
+        </w:tc>
+      </w:tr>
+      <w:tr>
+        <w:tc>
+          <w:tcPr/>
+          <w:p>
+            <w:pPr>
+              <w:pStyle w:val="Compact"/>
+              <w:jc w:val="left"/>
+            </w:pPr>
+            <w:r>
+              <w:t xml:space="preserve">Profundidad de instalación</w:t>
+            </w:r>
+          </w:p>
+        </w:tc>
+        <w:tc>
+          <w:tcPr/>
+          <w:p>
+            <w:pPr>
+              <w:pStyle w:val="Compact"/>
+              <w:jc w:val="left"/>
+            </w:pPr>
+            <w:r>
+              <w:t xml:space="preserve">50 metros</w:t>
+            </w:r>
+          </w:p>
+        </w:tc>
+      </w:tr>
+      <w:tr>
+        <w:tc>
+          <w:tcPr/>
+          <w:p>
+            <w:pPr>
+              <w:pStyle w:val="Compact"/>
+              <w:jc w:val="left"/>
+            </w:pPr>
+            <w:r>
+              <w:t xml:space="preserve">Caudal medido</w:t>
+            </w:r>
+          </w:p>
+        </w:tc>
+        <w:tc>
+          <w:tcPr/>
+          <w:p>
+            <w:pPr>
+              <w:pStyle w:val="Compact"/>
+              <w:jc w:val="left"/>
+            </w:pPr>
+            <w:r>
+              <w:t xml:space="preserve">4.2 L/s (15.12 m³/h)</w:t>
+            </w:r>
+          </w:p>
+        </w:tc>
+      </w:tr>
+      <w:tr>
+        <w:tc>
+          <w:tcPr/>
+          <w:p>
+            <w:pPr>
+              <w:pStyle w:val="Compact"/>
+              <w:jc w:val="left"/>
+            </w:pPr>
+            <w:r>
+              <w:t xml:space="preserve">Régimen de operación</w:t>
+            </w:r>
+          </w:p>
+        </w:tc>
+        <w:tc>
+          <w:tcPr/>
+          <w:p>
+            <w:pPr>
+              <w:pStyle w:val="Compact"/>
+              <w:jc w:val="left"/>
+            </w:pPr>
+            <w:r>
+              <w:t xml:space="preserve">Automático con presostato</w:t>
+            </w:r>
+          </w:p>
+        </w:tc>
+      </w:tr>
+      <w:tr>
+        <w:tc>
+          <w:tcPr/>
+          <w:p>
+            <w:pPr>
+              <w:pStyle w:val="Compact"/>
+              <w:jc w:val="left"/>
+            </w:pPr>
+            <w:r>
+              <w:t xml:space="preserve">Presión nominal de trabajo</w:t>
+            </w:r>
+          </w:p>
+        </w:tc>
+        <w:tc>
+          <w:tcPr/>
+          <w:p>
+            <w:pPr>
+              <w:pStyle w:val="Compact"/>
+              <w:jc w:val="left"/>
+            </w:pPr>
+            <w:r>
+              <w:t xml:space="preserve">3.5 bar</w:t>
+            </w:r>
+          </w:p>
+        </w:tc>
+      </w:tr>
+      <w:tr>
+        <w:tc>
+          <w:tcPr/>
+          <w:p>
+            <w:pPr>
+              <w:pStyle w:val="Compact"/>
+              <w:jc w:val="left"/>
+            </w:pPr>
+            <w:r>
+              <w:t xml:space="preserve">Presión máxima de corte</w:t>
+            </w:r>
+          </w:p>
+        </w:tc>
+        <w:tc>
+          <w:tcPr/>
+          <w:p>
+            <w:pPr>
+              <w:pStyle w:val="Compact"/>
+              <w:jc w:val="left"/>
+            </w:pPr>
+            <w:r>
+              <w:t xml:space="preserve">4.0 bar</w:t>
+            </w:r>
+          </w:p>
+        </w:tc>
+      </w:tr>
+      <w:tr>
+        <w:tc>
+          <w:tcPr/>
+          <w:p>
+            <w:pPr>
+              <w:pStyle w:val="Compact"/>
+              <w:jc w:val="left"/>
+            </w:pPr>
+            <w:r>
+              <w:t xml:space="preserve">Tanque hidroneumático</w:t>
+            </w:r>
+          </w:p>
+        </w:tc>
+        <w:tc>
+          <w:tcPr/>
+          <w:p>
+            <w:pPr>
+              <w:pStyle w:val="Compact"/>
+              <w:jc w:val="left"/>
+            </w:pPr>
+            <w:r>
+              <w:t xml:space="preserve">Sí, integrado al sistema de presión</w:t>
+            </w:r>
+          </w:p>
+        </w:tc>
+      </w:tr>
+      <w:tr>
+        <w:tc>
+          <w:tcPr/>
+          <w:p>
+            <w:pPr>
+              <w:pStyle w:val="Compact"/>
+              <w:jc w:val="left"/>
+            </w:pPr>
+            <w:r>
+              <w:t xml:space="preserve">Operación simultánea</w:t>
+            </w:r>
+          </w:p>
+        </w:tc>
+        <w:tc>
+          <w:tcPr/>
+          <w:p>
+            <w:pPr>
+              <w:pStyle w:val="Compact"/>
+              <w:jc w:val="left"/>
+            </w:pPr>
+            <w:r>
+              <w:t xml:space="preserve">Una sola electroválvula activa por vez</w:t>
+            </w:r>
+          </w:p>
+        </w:tc>
+      </w:tr>
+    </w:tbl>
+    <w:bookmarkEnd w:id="133"/>
+    <w:bookmarkStart w:id="134" w:name="a.2.-red-hidráulica"/>
+    <w:p>
+      <w:pPr>
+        <w:pStyle w:val="Heading3"/>
+      </w:pPr>
+      <w:r>
+        <w:rPr>
+          <w:rStyle w:val="SectionNumber"/>
+        </w:rPr>
+        <w:t xml:space="preserve">7.1.2</w:t>
+      </w:r>
+      <w:r>
+        <w:tab/>
+      </w:r>
+      <w:r>
+        <w:t xml:space="preserve">A.2. Red Hidráulica</w:t>
+      </w:r>
+    </w:p>
+    <w:p>
+      <w:pPr>
+        <w:pStyle w:val="FirstParagraph"/>
+      </w:pPr>
+      <w:r>
+        <w:rPr>
+          <w:bCs/>
+          <w:b/>
+        </w:rPr>
+        <w:t xml:space="preserve">Tabla A.2. Especificaciones de tuberías y accesorios</w:t>
+      </w:r>
+    </w:p>
+    <w:tbl>
+      <w:tblPr>
+        <w:tblStyle w:val="Table"/>
+        <w:tblW w:type="pct" w:w="5000"/>
+        <w:tblLook w:firstRow="1" w:lastRow="0" w:firstColumn="0" w:lastColumn="0" w:noHBand="0" w:noVBand="0" w:val="0020"/>
+        <w:jc w:val="start"/>
+      </w:tblPr>
+      <w:tblGrid>
+        <w:gridCol w:w="3394"/>
+        <w:gridCol w:w="4525"/>
+      </w:tblGrid>
+      <w:tr>
+        <w:trPr>
+          <w:tblHeader w:val="true"/>
+        </w:trPr>
+        <w:tc>
+          <w:tcPr/>
+          <w:p>
+            <w:pPr>
+              <w:pStyle w:val="Compact"/>
+              <w:jc w:val="left"/>
+            </w:pPr>
+            <w:r>
+              <w:t xml:space="preserve">Componente</w:t>
+            </w:r>
+          </w:p>
+        </w:tc>
+        <w:tc>
+          <w:tcPr/>
+          <w:p>
+            <w:pPr>
+              <w:pStyle w:val="Compact"/>
+              <w:jc w:val="left"/>
+            </w:pPr>
+            <w:r>
+              <w:t xml:space="preserve">Especificación</w:t>
+            </w:r>
+          </w:p>
+        </w:tc>
+      </w:tr>
+      <w:tr>
+        <w:tc>
+          <w:tcPr/>
+          <w:p>
+            <w:pPr>
+              <w:pStyle w:val="Compact"/>
+              <w:jc w:val="left"/>
+            </w:pPr>
+            <w:r>
+              <w:t xml:space="preserve">Tubería matriz (salida de bomba)</w:t>
+            </w:r>
+          </w:p>
+        </w:tc>
+        <w:tc>
+          <w:tcPr/>
+          <w:p>
+            <w:pPr>
+              <w:pStyle w:val="Compact"/>
+              <w:jc w:val="left"/>
+            </w:pPr>
+            <w:r>
+              <w:t xml:space="preserve">PVC, 2” de diámetro</w:t>
+            </w:r>
+          </w:p>
+        </w:tc>
+      </w:tr>
+      <w:tr>
+        <w:tc>
+          <w:tcPr/>
+          <w:p>
+            <w:pPr>
+              <w:pStyle w:val="Compact"/>
+              <w:jc w:val="left"/>
+            </w:pPr>
+            <w:r>
+              <w:t xml:space="preserve">Cuelleras (matriz → solenoides)</w:t>
+            </w:r>
+          </w:p>
+        </w:tc>
+        <w:tc>
+          <w:tcPr/>
+          <w:p>
+            <w:pPr>
+              <w:pStyle w:val="Compact"/>
+              <w:jc w:val="left"/>
+            </w:pPr>
+            <w:r>
+              <w:t xml:space="preserve">PVC, 1 ½” de diámetro</w:t>
+            </w:r>
+          </w:p>
+        </w:tc>
+      </w:tr>
+      <w:tr>
+        <w:tc>
+          <w:tcPr/>
+          <w:p>
+            <w:pPr>
+              <w:pStyle w:val="Compact"/>
+              <w:jc w:val="left"/>
+            </w:pPr>
+            <w:r>
+              <w:t xml:space="preserve">Material general</w:t>
+            </w:r>
+          </w:p>
+        </w:tc>
+        <w:tc>
+          <w:tcPr/>
+          <w:p>
+            <w:pPr>
+              <w:pStyle w:val="Compact"/>
+              <w:jc w:val="left"/>
+            </w:pPr>
+            <w:r>
+              <w:t xml:space="preserve">PVC sanitario</w:t>
+            </w:r>
+          </w:p>
+        </w:tc>
+      </w:tr>
+      <w:tr>
+        <w:tc>
+          <w:tcPr/>
+          <w:p>
+            <w:pPr>
+              <w:pStyle w:val="Compact"/>
+              <w:jc w:val="left"/>
+            </w:pPr>
+            <w:r>
+              <w:t xml:space="preserve">Profundidad de enterramiento — matriz</w:t>
+            </w:r>
+          </w:p>
+        </w:tc>
+        <w:tc>
+          <w:tcPr/>
+          <w:p>
+            <w:pPr>
+              <w:pStyle w:val="Compact"/>
+              <w:jc w:val="left"/>
+            </w:pPr>
+            <w:r>
+              <w:t xml:space="preserve">30 cm</w:t>
+            </w:r>
+          </w:p>
+        </w:tc>
+      </w:tr>
+      <w:tr>
+        <w:tc>
+          <w:tcPr/>
+          <w:p>
+            <w:pPr>
+              <w:pStyle w:val="Compact"/>
+              <w:jc w:val="left"/>
+            </w:pPr>
+            <w:r>
+              <w:t xml:space="preserve">Profundidad de enterramiento — cuelleras</w:t>
+            </w:r>
+          </w:p>
+        </w:tc>
+        <w:tc>
+          <w:tcPr/>
+          <w:p>
+            <w:pPr>
+              <w:pStyle w:val="Compact"/>
+              <w:jc w:val="left"/>
+            </w:pPr>
+            <w:r>
+              <w:t xml:space="preserve">20-25 cm</w:t>
+            </w:r>
+          </w:p>
+        </w:tc>
+      </w:tr>
+      <w:tr>
+        <w:tc>
+          <w:tcPr/>
+          <w:p>
+            <w:pPr>
+              <w:pStyle w:val="Compact"/>
+              <w:jc w:val="left"/>
+            </w:pPr>
+            <w:r>
+              <w:t xml:space="preserve">Llaves de paso de respaldo</w:t>
+            </w:r>
+          </w:p>
+        </w:tc>
+        <w:tc>
+          <w:tcPr/>
+          <w:p>
+            <w:pPr>
+              <w:pStyle w:val="Compact"/>
+              <w:jc w:val="left"/>
+            </w:pPr>
+            <w:r>
+              <w:t xml:space="preserve">Manuales tipo bola, color rojo, 1 ½”</w:t>
+            </w:r>
+          </w:p>
+        </w:tc>
+      </w:tr>
+      <w:tr>
+        <w:tc>
+          <w:tcPr/>
+          <w:p>
+            <w:pPr>
+              <w:pStyle w:val="Compact"/>
+              <w:jc w:val="left"/>
+            </w:pPr>
+            <w:r>
+              <w:t xml:space="preserve">Cajas de válvula</w:t>
+            </w:r>
+          </w:p>
+        </w:tc>
+        <w:tc>
+          <w:tcPr/>
+          <w:p>
+            <w:pPr>
+              <w:pStyle w:val="Compact"/>
+              <w:jc w:val="left"/>
+            </w:pPr>
+            <w:r>
+              <w:t xml:space="preserve">Hormigón armado, 40 × 40 × 30 cm</w:t>
+            </w:r>
+          </w:p>
+        </w:tc>
+      </w:tr>
+      <w:tr>
+        <w:tc>
+          <w:tcPr/>
+          <w:p>
+            <w:pPr>
+              <w:pStyle w:val="Compact"/>
+              <w:jc w:val="left"/>
+            </w:pPr>
+            <w:r>
+              <w:t xml:space="preserve">Sistema de empalmes</w:t>
+            </w:r>
+          </w:p>
+        </w:tc>
+        <w:tc>
+          <w:tcPr/>
+          <w:p>
+            <w:pPr>
+              <w:pStyle w:val="Compact"/>
+              <w:jc w:val="left"/>
+            </w:pPr>
+            <w:r>
+              <w:t xml:space="preserve">Conectores impermeabilizados con cinta autovulcanizante</w:t>
+            </w:r>
+          </w:p>
+        </w:tc>
+      </w:tr>
+    </w:tbl>
+    <w:bookmarkEnd w:id="134"/>
+    <w:bookmarkStart w:id="135" w:name="a.3.-sistema-eléctrico-de-control"/>
+    <w:p>
+      <w:pPr>
+        <w:pStyle w:val="Heading3"/>
+      </w:pPr>
+      <w:r>
+        <w:rPr>
+          <w:rStyle w:val="SectionNumber"/>
+        </w:rPr>
+        <w:t xml:space="preserve">7.1.3</w:t>
+      </w:r>
+      <w:r>
+        <w:tab/>
+      </w:r>
+      <w:r>
+        <w:t xml:space="preserve">A.3. Sistema Eléctrico de Control</w:t>
+      </w:r>
+    </w:p>
+    <w:p>
+      <w:pPr>
+        <w:pStyle w:val="FirstParagraph"/>
+      </w:pPr>
+      <w:r>
+        <w:rPr>
+          <w:bCs/>
+          <w:b/>
+        </w:rPr>
+        <w:t xml:space="preserve">Tabla A.3. Especificaciones del cableado y solenoides</w:t>
+      </w:r>
+    </w:p>
+    <w:tbl>
+      <w:tblPr>
+        <w:tblStyle w:val="Table"/>
+        <w:tblW w:type="pct" w:w="5000"/>
+        <w:tblLook w:firstRow="1" w:lastRow="0" w:firstColumn="0" w:lastColumn="0" w:noHBand="0" w:noVBand="0" w:val="0020"/>
+        <w:jc w:val="start"/>
+      </w:tblPr>
+      <w:tblGrid>
+        <w:gridCol w:w="3394"/>
+        <w:gridCol w:w="4525"/>
+      </w:tblGrid>
+      <w:tr>
+        <w:trPr>
+          <w:tblHeader w:val="true"/>
+        </w:trPr>
+        <w:tc>
+          <w:tcPr/>
+          <w:p>
+            <w:pPr>
+              <w:pStyle w:val="Compact"/>
+              <w:jc w:val="left"/>
+            </w:pPr>
+            <w:r>
+              <w:t xml:space="preserve">Componente</w:t>
+            </w:r>
+          </w:p>
+        </w:tc>
+        <w:tc>
+          <w:tcPr/>
+          <w:p>
+            <w:pPr>
+              <w:pStyle w:val="Compact"/>
+              <w:jc w:val="left"/>
+            </w:pPr>
+            <w:r>
+              <w:t xml:space="preserve">Especificación</w:t>
+            </w:r>
+          </w:p>
+        </w:tc>
+      </w:tr>
+      <w:tr>
+        <w:tc>
+          <w:tcPr/>
+          <w:p>
+            <w:pPr>
+              <w:pStyle w:val="Compact"/>
+              <w:jc w:val="left"/>
+            </w:pPr>
+            <w:r>
+              <w:t xml:space="preserve">Cable de control</w:t>
+            </w:r>
+          </w:p>
+        </w:tc>
+        <w:tc>
+          <w:tcPr/>
+          <w:p>
+            <w:pPr>
+              <w:pStyle w:val="Compact"/>
+              <w:jc w:val="left"/>
+            </w:pPr>
+            <w:r>
+              <w:t xml:space="preserve">20 AWG, monofilar (un solo conductor por solenoide)</w:t>
+            </w:r>
+          </w:p>
+        </w:tc>
+      </w:tr>
+      <w:tr>
+        <w:tc>
+          <w:tcPr/>
+          <w:p>
+            <w:pPr>
+              <w:pStyle w:val="Compact"/>
+              <w:jc w:val="left"/>
+            </w:pPr>
+            <w:r>
+              <w:t xml:space="preserve">Protección del cable</w:t>
+            </w:r>
+          </w:p>
+        </w:tc>
+        <w:tc>
+          <w:tcPr/>
+          <w:p>
+            <w:pPr>
+              <w:pStyle w:val="Compact"/>
+              <w:jc w:val="left"/>
+            </w:pPr>
+            <w:r>
+              <w:t xml:space="preserve">Politubo de polietileno negro, 3/4” de diámetro</w:t>
+            </w:r>
+          </w:p>
+        </w:tc>
+      </w:tr>
+      <w:tr>
+        <w:tc>
+          <w:tcPr/>
+          <w:p>
+            <w:pPr>
+              <w:pStyle w:val="Compact"/>
+              <w:jc w:val="left"/>
+            </w:pPr>
+            <w:r>
+              <w:t xml:space="preserve">Profundidad de zanja del politubo</w:t>
+            </w:r>
+          </w:p>
+        </w:tc>
+        <w:tc>
+          <w:tcPr/>
+          <w:p>
+            <w:pPr>
+              <w:pStyle w:val="Compact"/>
+              <w:jc w:val="left"/>
+            </w:pPr>
+            <w:r>
+              <w:t xml:space="preserve">20-25 cm</w:t>
+            </w:r>
+          </w:p>
+        </w:tc>
+      </w:tr>
+      <w:tr>
+        <w:tc>
+          <w:tcPr/>
+          <w:p>
+            <w:pPr>
+              <w:pStyle w:val="Compact"/>
+              <w:jc w:val="left"/>
+            </w:pPr>
+            <w:r>
+              <w:t xml:space="preserve">Longitud máxima de cable por solenoide</w:t>
+            </w:r>
+          </w:p>
+        </w:tc>
+        <w:tc>
+          <w:tcPr/>
+          <w:p>
+            <w:pPr>
+              <w:pStyle w:val="Compact"/>
+              <w:jc w:val="left"/>
+            </w:pPr>
+            <w:r>
+              <w:t xml:space="preserve">30 metros</w:t>
+            </w:r>
+          </w:p>
+        </w:tc>
+      </w:tr>
+      <w:tr>
+        <w:tc>
+          <w:tcPr/>
+          <w:p>
+            <w:pPr>
+              <w:pStyle w:val="Compact"/>
+              <w:jc w:val="left"/>
+            </w:pPr>
+            <w:r>
+              <w:t xml:space="preserve">Solenoides (electroválvulas)</w:t>
+            </w:r>
+          </w:p>
+        </w:tc>
+        <w:tc>
+          <w:tcPr/>
+          <w:p>
+            <w:pPr>
+              <w:pStyle w:val="Compact"/>
+              <w:jc w:val="left"/>
+            </w:pPr>
+            <w:r>
+              <w:t xml:space="preserve">K-Rain BSPT, 9 V DC tipo latching</w:t>
+            </w:r>
+          </w:p>
+        </w:tc>
+      </w:tr>
+      <w:tr>
+        <w:tc>
+          <w:tcPr/>
+          <w:p>
+            <w:pPr>
+              <w:pStyle w:val="Compact"/>
+              <w:jc w:val="left"/>
+            </w:pPr>
+            <w:r>
+              <w:t xml:space="preserve">Voltaje de actuación</w:t>
+            </w:r>
+          </w:p>
+        </w:tc>
+        <w:tc>
+          <w:tcPr/>
+          <w:p>
+            <w:pPr>
+              <w:pStyle w:val="Compact"/>
+              <w:jc w:val="left"/>
+            </w:pPr>
+            <w:r>
+              <w:t xml:space="preserve">Pulsos de 9 V DC, polaridad positiva (apertura) y negativa (cierre)</w:t>
+            </w:r>
+          </w:p>
+        </w:tc>
+      </w:tr>
+      <w:tr>
+        <w:tc>
+          <w:tcPr/>
+          <w:p>
+            <w:pPr>
+              <w:pStyle w:val="Compact"/>
+              <w:jc w:val="left"/>
+            </w:pPr>
+            <w:r>
+              <w:t xml:space="preserve">Consumo en estado estable</w:t>
+            </w:r>
+          </w:p>
+        </w:tc>
+        <w:tc>
+          <w:tcPr/>
+          <w:p>
+            <w:pPr>
+              <w:pStyle w:val="Compact"/>
+              <w:jc w:val="left"/>
+            </w:pPr>
+            <w:r>
+              <w:t xml:space="preserve">0 W (latching — sin consumo continuo)</w:t>
+            </w:r>
+          </w:p>
+        </w:tc>
+      </w:tr>
+      <w:tr>
+        <w:tc>
+          <w:tcPr/>
+          <w:p>
+            <w:pPr>
+              <w:pStyle w:val="Compact"/>
+              <w:jc w:val="left"/>
+            </w:pPr>
+            <w:r>
+              <w:t xml:space="preserve">Alimentación de controladores</w:t>
+            </w:r>
+          </w:p>
+        </w:tc>
+        <w:tc>
+          <w:tcPr/>
+          <w:p>
+            <w:pPr>
+              <w:pStyle w:val="Compact"/>
+              <w:jc w:val="left"/>
+            </w:pPr>
+            <w:r>
+              <w:t xml:space="preserve">Baterías 9 V (alcalinas, autonomía ~1 año)</w:t>
+            </w:r>
+          </w:p>
+        </w:tc>
+      </w:tr>
+    </w:tbl>
+    <w:bookmarkEnd w:id="135"/>
+    <w:bookmarkStart w:id="136" w:name="a.4.-controladores-k-rain-bl-kr"/>
+    <w:p>
+      <w:pPr>
+        <w:pStyle w:val="Heading3"/>
+      </w:pPr>
+      <w:r>
+        <w:rPr>
+          <w:rStyle w:val="SectionNumber"/>
+        </w:rPr>
+        <w:t xml:space="preserve">7.1.4</w:t>
+      </w:r>
+      <w:r>
+        <w:tab/>
+      </w:r>
+      <w:r>
+        <w:t xml:space="preserve">A.4. Controladores K-Rain BL-KR</w:t>
+      </w:r>
+    </w:p>
+    <w:p>
+      <w:pPr>
+        <w:pStyle w:val="FirstParagraph"/>
+      </w:pPr>
+      <w:r>
+        <w:rPr>
+          <w:bCs/>
+          <w:b/>
+        </w:rPr>
+        <w:t xml:space="preserve">Tabla A.4. Distribución de controladores en el parque</w:t>
+      </w:r>
+    </w:p>
+    <w:tbl>
+      <w:tblPr>
+        <w:tblStyle w:val="Table"/>
+        <w:tblW w:type="pct" w:w="5000"/>
+        <w:tblLook w:firstRow="1" w:lastRow="0" w:firstColumn="0" w:lastColumn="0" w:noHBand="0" w:noVBand="0" w:val="0020"/>
+        <w:jc w:val="start"/>
+      </w:tblPr>
+      <w:tblGrid>
+        <w:gridCol w:w="609"/>
+        <w:gridCol w:w="1218"/>
+        <w:gridCol w:w="2741"/>
+        <w:gridCol w:w="3350"/>
+      </w:tblGrid>
+      <w:tr>
+        <w:trPr>
+          <w:tblHeader w:val="true"/>
+        </w:trPr>
+        <w:tc>
+          <w:tcPr/>
+          <w:p>
+            <w:pPr>
+              <w:pStyle w:val="Compact"/>
+              <w:jc w:val="left"/>
+            </w:pPr>
+            <w:r>
+              <w:t xml:space="preserve">ID</w:t>
+            </w:r>
+          </w:p>
+        </w:tc>
+        <w:tc>
+          <w:tcPr/>
+          <w:p>
+            <w:pPr>
+              <w:pStyle w:val="Compact"/>
+              <w:jc w:val="left"/>
+            </w:pPr>
+            <w:r>
+              <w:t xml:space="preserve">Modelo</w:t>
+            </w:r>
+          </w:p>
+        </w:tc>
+        <w:tc>
+          <w:tcPr/>
+          <w:p>
+            <w:pPr>
+              <w:pStyle w:val="Compact"/>
+              <w:jc w:val="left"/>
+            </w:pPr>
+            <w:r>
+              <w:t xml:space="preserve">Nº de estaciones</w:t>
+            </w:r>
+          </w:p>
+        </w:tc>
+        <w:tc>
+          <w:tcPr/>
+          <w:p>
+            <w:pPr>
+              <w:pStyle w:val="Compact"/>
+              <w:jc w:val="left"/>
+            </w:pPr>
+            <w:r>
+              <w:t xml:space="preserve">Ubicación referencial</w:t>
+            </w:r>
+          </w:p>
+        </w:tc>
+      </w:tr>
+      <w:tr>
+        <w:tc>
+          <w:tcPr/>
+          <w:p>
+            <w:pPr>
+              <w:pStyle w:val="Compact"/>
+              <w:jc w:val="left"/>
+            </w:pPr>
+            <w:r>
+              <w:t xml:space="preserve">C1</w:t>
+            </w:r>
+          </w:p>
+        </w:tc>
+        <w:tc>
+          <w:tcPr/>
+          <w:p>
+            <w:pPr>
+              <w:pStyle w:val="Compact"/>
+              <w:jc w:val="left"/>
+            </w:pPr>
+            <w:r>
+              <w:t xml:space="preserve">BL-KR2</w:t>
+            </w:r>
+          </w:p>
+        </w:tc>
+        <w:tc>
+          <w:tcPr/>
+          <w:p>
+            <w:pPr>
+              <w:pStyle w:val="Compact"/>
+              <w:jc w:val="left"/>
+            </w:pPr>
+            <w:r>
+              <w:t xml:space="preserve">2</w:t>
+            </w:r>
+          </w:p>
+        </w:tc>
+        <w:tc>
+          <w:tcPr/>
+          <w:p>
+            <w:pPr>
+              <w:pStyle w:val="Compact"/>
+              <w:jc w:val="left"/>
+            </w:pPr>
+            <w:r>
+              <w:t xml:space="preserve">Sector zona A — proximidades caseta bomba</w:t>
+            </w:r>
+          </w:p>
+        </w:tc>
+      </w:tr>
+      <w:tr>
+        <w:tc>
+          <w:tcPr/>
+          <w:p>
+            <w:pPr>
+              <w:pStyle w:val="Compact"/>
+              <w:jc w:val="left"/>
+            </w:pPr>
+            <w:r>
+              <w:t xml:space="preserve">C2</w:t>
+            </w:r>
+          </w:p>
+        </w:tc>
+        <w:tc>
+          <w:tcPr/>
+          <w:p>
+            <w:pPr>
+              <w:pStyle w:val="Compact"/>
+              <w:jc w:val="left"/>
+            </w:pPr>
+            <w:r>
+              <w:t xml:space="preserve">BL-KR2</w:t>
+            </w:r>
+          </w:p>
+        </w:tc>
+        <w:tc>
+          <w:tcPr/>
+          <w:p>
+            <w:pPr>
+              <w:pStyle w:val="Compact"/>
+              <w:jc w:val="left"/>
+            </w:pPr>
+            <w:r>
+              <w:t xml:space="preserve">2</w:t>
+            </w:r>
+          </w:p>
+        </w:tc>
+        <w:tc>
+          <w:tcPr/>
+          <w:p>
+            <w:pPr>
+              <w:pStyle w:val="Compact"/>
+              <w:jc w:val="left"/>
+            </w:pPr>
+            <w:r>
+              <w:t xml:space="preserve">Sector zona B — área laberinto</w:t>
+            </w:r>
+          </w:p>
+        </w:tc>
+      </w:tr>
+      <w:tr>
+        <w:tc>
+          <w:tcPr/>
+          <w:p>
+            <w:pPr>
+              <w:pStyle w:val="Compact"/>
+              <w:jc w:val="left"/>
+            </w:pPr>
+            <w:r>
+              <w:t xml:space="preserve">C3</w:t>
+            </w:r>
+          </w:p>
+        </w:tc>
+        <w:tc>
+          <w:tcPr/>
+          <w:p>
+            <w:pPr>
+              <w:pStyle w:val="Compact"/>
+              <w:jc w:val="left"/>
+            </w:pPr>
+            <w:r>
+              <w:t xml:space="preserve">BL-KR4</w:t>
+            </w:r>
+          </w:p>
+        </w:tc>
+        <w:tc>
+          <w:tcPr/>
+          <w:p>
+            <w:pPr>
+              <w:pStyle w:val="Compact"/>
+              <w:jc w:val="left"/>
+            </w:pPr>
+            <w:r>
+              <w:t xml:space="preserve">4</w:t>
+            </w:r>
+          </w:p>
+        </w:tc>
+        <w:tc>
+          <w:tcPr/>
+          <w:p>
+            <w:pPr>
+              <w:pStyle w:val="Compact"/>
+              <w:jc w:val="left"/>
+            </w:pPr>
+            <w:r>
+              <w:t xml:space="preserve">Sector zona C — paseo de olivos</w:t>
+            </w:r>
+          </w:p>
+        </w:tc>
+      </w:tr>
+      <w:tr>
+        <w:tc>
+          <w:tcPr/>
+          <w:p>
+            <w:pPr>
+              <w:pStyle w:val="Compact"/>
+              <w:jc w:val="left"/>
+            </w:pPr>
+            <w:r>
+              <w:t xml:space="preserve">C4</w:t>
+            </w:r>
+          </w:p>
+        </w:tc>
+        <w:tc>
+          <w:tcPr/>
+          <w:p>
+            <w:pPr>
+              <w:pStyle w:val="Compact"/>
+              <w:jc w:val="left"/>
+            </w:pPr>
+            <w:r>
+              <w:t xml:space="preserve">BL-KR4</w:t>
+            </w:r>
+          </w:p>
+        </w:tc>
+        <w:tc>
+          <w:tcPr/>
+          <w:p>
+            <w:pPr>
+              <w:pStyle w:val="Compact"/>
+              <w:jc w:val="left"/>
+            </w:pPr>
+            <w:r>
+              <w:t xml:space="preserve">4</w:t>
+            </w:r>
+          </w:p>
+        </w:tc>
+        <w:tc>
+          <w:tcPr/>
+          <w:p>
+            <w:pPr>
+              <w:pStyle w:val="Compact"/>
+              <w:jc w:val="left"/>
+            </w:pPr>
+            <w:r>
+              <w:t xml:space="preserve">Sector zona D — curvas cromáticas</w:t>
+            </w:r>
+          </w:p>
+        </w:tc>
+      </w:tr>
+      <w:tr>
+        <w:tc>
+          <w:tcPr/>
+          <w:p>
+            <w:pPr>
+              <w:pStyle w:val="Compact"/>
+              <w:jc w:val="left"/>
+            </w:pPr>
+            <w:r>
+              <w:t xml:space="preserve">C5</w:t>
+            </w:r>
+          </w:p>
+        </w:tc>
+        <w:tc>
+          <w:tcPr/>
+          <w:p>
+            <w:pPr>
+              <w:pStyle w:val="Compact"/>
+              <w:jc w:val="left"/>
+            </w:pPr>
+            <w:r>
+              <w:t xml:space="preserve">BL-KR4</w:t>
+            </w:r>
+          </w:p>
+        </w:tc>
+        <w:tc>
+          <w:tcPr/>
+          <w:p>
+            <w:pPr>
+              <w:pStyle w:val="Compact"/>
+              <w:jc w:val="left"/>
+            </w:pPr>
+            <w:r>
+              <w:t xml:space="preserve">4</w:t>
+            </w:r>
+          </w:p>
+        </w:tc>
+        <w:tc>
+          <w:tcPr/>
+          <w:p>
+            <w:pPr>
+              <w:pStyle w:val="Compact"/>
+              <w:jc w:val="left"/>
+            </w:pPr>
+            <w:r>
+              <w:t xml:space="preserve">Sector zona E — frutales y huerto</w:t>
+            </w:r>
+          </w:p>
+        </w:tc>
+      </w:tr>
+      <w:tr>
+        <w:tc>
+          <w:tcPr/>
+          <w:p>
+            <w:pPr>
+              <w:pStyle w:val="Compact"/>
+              <w:jc w:val="left"/>
+            </w:pPr>
+            <w:r>
+              <w:t xml:space="preserve">C6</w:t>
+            </w:r>
+          </w:p>
+        </w:tc>
+        <w:tc>
+          <w:tcPr/>
+          <w:p>
+            <w:pPr>
+              <w:pStyle w:val="Compact"/>
+              <w:jc w:val="left"/>
+            </w:pPr>
+            <w:r>
+              <w:t xml:space="preserve">BL-KR6</w:t>
+            </w:r>
+          </w:p>
+        </w:tc>
+        <w:tc>
+          <w:tcPr/>
+          <w:p>
+            <w:pPr>
+              <w:pStyle w:val="Compact"/>
+              <w:jc w:val="left"/>
+            </w:pPr>
+            <w:r>
+              <w:t xml:space="preserve">6</w:t>
+            </w:r>
+          </w:p>
+        </w:tc>
+        <w:tc>
+          <w:tcPr/>
+          <w:p>
+            <w:pPr>
+              <w:pStyle w:val="Compact"/>
+              <w:jc w:val="left"/>
+            </w:pPr>
+            <w:r>
+              <w:t xml:space="preserve">Sector zona F — área central y suculentas</w:t>
+            </w:r>
+          </w:p>
+        </w:tc>
+      </w:tr>
+      <w:tr>
+        <w:tc>
+          <w:tcPr/>
+          <w:p>
+            <w:pPr>
+              <w:pStyle w:val="Compact"/>
+              <w:jc w:val="left"/>
+            </w:pPr>
+            <w:r>
+              <w:rPr>
+                <w:bCs/>
+                <w:b/>
+              </w:rPr>
+              <w:t xml:space="preserve">Total</w:t>
+            </w:r>
+          </w:p>
+        </w:tc>
+        <w:tc>
+          <w:tcPr/>
+          <w:p>
+            <w:pPr>
+              <w:pStyle w:val="Compact"/>
+              <w:jc w:val="left"/>
+            </w:pPr>
+            <w:r>
+              <w:rPr>
+                <w:bCs/>
+                <w:b/>
+              </w:rPr>
+              <w:t xml:space="preserve">6 controladores</w:t>
+            </w:r>
+          </w:p>
+        </w:tc>
+        <w:tc>
+          <w:tcPr/>
+          <w:p>
+            <w:pPr>
+              <w:pStyle w:val="Compact"/>
+              <w:jc w:val="left"/>
+            </w:pPr>
+            <w:r>
+              <w:rPr>
+                <w:bCs/>
+                <w:b/>
+              </w:rPr>
+              <w:t xml:space="preserve">22 estaciones</w:t>
+            </w:r>
+          </w:p>
+        </w:tc>
+        <w:tc>
+          <w:tcPr/>
+          <w:p>
+            <w:pPr>
+              <w:pStyle w:val="Compact"/>
+              <w:jc w:val="left"/>
+            </w:pPr>
+            <w:r>
+              <w:rPr>
+                <w:bCs/>
+                <w:b/>
+              </w:rPr>
+              <w:t xml:space="preserve">5 hectáreas cubiertas</w:t>
+            </w:r>
+          </w:p>
+        </w:tc>
+      </w:tr>
+    </w:tbl>
+    <w:p>
+      <w:pPr>
+        <w:pStyle w:val="BodyText"/>
       </w:pPr>
       <w:r>
         <w:rPr>
           <w:iCs/>
           <w:i/>
         </w:rPr>
-        <w:t xml:space="preserve">Documento generado para el Trabajo de Grado — Instituto Tecnológico Superior de Sacaba (ITSa)</w:t>
-      </w:r>
-      <w:r>
-        <w:t xml:space="preserve"> </w:t>
-      </w:r>
+        <w:t xml:space="preserve">Nota: La configuración con 22 estaciones (en lugar de 41 puntos manuales originales) responde a la optimización del cableado, garantizando que ningún solenoide quede a más de 30 metros lineales del controlador correspondiente. Algunas zonas hidráulicas comparten una misma electroválvula que alimenta múltiples ramales de aspersión.</w:t>
+      </w:r>
+    </w:p>
+    <w:bookmarkEnd w:id="136"/>
+    <w:bookmarkStart w:id="137" w:name="a.5.-plataforma-de-software-académica"/>
+    <w:p>
+      <w:pPr>
+        <w:pStyle w:val="Heading3"/>
+      </w:pPr>
+      <w:r>
+        <w:rPr>
+          <w:rStyle w:val="SectionNumber"/>
+        </w:rPr>
+        <w:t xml:space="preserve">7.1.5</w:t>
+      </w:r>
+      <w:r>
+        <w:tab/>
+      </w:r>
+      <w:r>
+        <w:t xml:space="preserve">A.5. Plataforma de Software (académica)</w:t>
+      </w:r>
+    </w:p>
+    <w:p>
+      <w:pPr>
+        <w:pStyle w:val="FirstParagraph"/>
+      </w:pPr>
+      <w:r>
+        <w:rPr>
+          <w:bCs/>
+          <w:b/>
+        </w:rPr>
+        <w:t xml:space="preserve">Tabla A.5. Stack tecnológico del prototipo</w:t>
+      </w:r>
+    </w:p>
+    <w:tbl>
+      <w:tblPr>
+        <w:tblStyle w:val="Table"/>
+        <w:tblW w:type="auto" w:w="0"/>
+        <w:tblLook w:firstRow="1" w:lastRow="0" w:firstColumn="0" w:lastColumn="0" w:noHBand="0" w:noVBand="0" w:val="0020"/>
+        <w:jc w:val="start"/>
+      </w:tblPr>
+      <w:tblGrid>
+        <w:gridCol w:w="2640"/>
+        <w:gridCol w:w="2640"/>
+        <w:gridCol w:w="2640"/>
+      </w:tblGrid>
+      <w:tr>
+        <w:trPr>
+          <w:tblHeader w:val="true"/>
+        </w:trPr>
+        <w:tc>
+          <w:tcPr/>
+          <w:p>
+            <w:pPr>
+              <w:pStyle w:val="Compact"/>
+              <w:jc w:val="left"/>
+            </w:pPr>
+            <w:r>
+              <w:t xml:space="preserve">Capa</w:t>
+            </w:r>
+          </w:p>
+        </w:tc>
+        <w:tc>
+          <w:tcPr/>
+          <w:p>
+            <w:pPr>
+              <w:pStyle w:val="Compact"/>
+              <w:jc w:val="left"/>
+            </w:pPr>
+            <w:r>
+              <w:t xml:space="preserve">Tecnología</w:t>
+            </w:r>
+          </w:p>
+        </w:tc>
+        <w:tc>
+          <w:tcPr/>
+          <w:p>
+            <w:pPr>
+              <w:pStyle w:val="Compact"/>
+              <w:jc w:val="left"/>
+            </w:pPr>
+            <w:r>
+              <w:t xml:space="preserve">Versión</w:t>
+            </w:r>
+          </w:p>
+        </w:tc>
+      </w:tr>
+      <w:tr>
+        <w:tc>
+          <w:tcPr/>
+          <w:p>
+            <w:pPr>
+              <w:pStyle w:val="Compact"/>
+              <w:jc w:val="left"/>
+            </w:pPr>
+            <w:r>
+              <w:t xml:space="preserve">Microcontrolador</w:t>
+            </w:r>
+          </w:p>
+        </w:tc>
+        <w:tc>
+          <w:tcPr/>
+          <w:p>
+            <w:pPr>
+              <w:pStyle w:val="Compact"/>
+              <w:jc w:val="left"/>
+            </w:pPr>
+            <w:r>
+              <w:t xml:space="preserve">ESP32 DevKit V1 (prototipo académico)</w:t>
+            </w:r>
+          </w:p>
+        </w:tc>
+        <w:tc>
+          <w:tcPr/>
+          <w:p>
+            <w:pPr>
+              <w:pStyle w:val="Compact"/>
+              <w:jc w:val="left"/>
+            </w:pPr>
+            <w:r>
+              <w:t xml:space="preserve">—</w:t>
+            </w:r>
+          </w:p>
+        </w:tc>
+      </w:tr>
+      <w:tr>
+        <w:tc>
+          <w:tcPr/>
+          <w:p>
+            <w:pPr>
+              <w:pStyle w:val="Compact"/>
+              <w:jc w:val="left"/>
+            </w:pPr>
+            <w:r>
+              <w:t xml:space="preserve">Framework de firmware</w:t>
+            </w:r>
+          </w:p>
+        </w:tc>
+        <w:tc>
+          <w:tcPr/>
+          <w:p>
+            <w:pPr>
+              <w:pStyle w:val="Compact"/>
+              <w:jc w:val="left"/>
+            </w:pPr>
+            <w:r>
+              <w:t xml:space="preserve">Arduino Framework</w:t>
+            </w:r>
+          </w:p>
+        </w:tc>
+        <w:tc>
+          <w:tcPr/>
+          <w:p>
+            <w:pPr>
+              <w:pStyle w:val="Compact"/>
+              <w:jc w:val="left"/>
+            </w:pPr>
+            <w:r>
+              <w:t xml:space="preserve">2.x</w:t>
+            </w:r>
+          </w:p>
+        </w:tc>
+      </w:tr>
+      <w:tr>
+        <w:tc>
+          <w:tcPr/>
+          <w:p>
+            <w:pPr>
+              <w:pStyle w:val="Compact"/>
+              <w:jc w:val="left"/>
+            </w:pPr>
+            <w:r>
+              <w:t xml:space="preserve">Pila BLE</w:t>
+            </w:r>
+          </w:p>
+        </w:tc>
+        <w:tc>
+          <w:tcPr/>
+          <w:p>
+            <w:pPr>
+              <w:pStyle w:val="Compact"/>
+              <w:jc w:val="left"/>
+            </w:pPr>
+            <w:r>
+              <w:t xml:space="preserve">NimBLE-Arduino</w:t>
+            </w:r>
+          </w:p>
+        </w:tc>
+        <w:tc>
+          <w:tcPr/>
+          <w:p>
+            <w:pPr>
+              <w:pStyle w:val="Compact"/>
+              <w:jc w:val="left"/>
+            </w:pPr>
+            <w:r>
+              <w:t xml:space="preserve">1.4.1</w:t>
+            </w:r>
+          </w:p>
+        </w:tc>
+      </w:tr>
+      <w:tr>
+        <w:tc>
+          <w:tcPr/>
+          <w:p>
+            <w:pPr>
+              <w:pStyle w:val="Compact"/>
+              <w:jc w:val="left"/>
+            </w:pPr>
+            <w:r>
+              <w:t xml:space="preserve">Frontend</w:t>
+            </w:r>
+          </w:p>
+        </w:tc>
+        <w:tc>
+          <w:tcPr/>
+          <w:p>
+            <w:pPr>
+              <w:pStyle w:val="Compact"/>
+              <w:jc w:val="left"/>
+            </w:pPr>
+            <w:r>
+              <w:t xml:space="preserve">React + TypeScript + Vite</w:t>
+            </w:r>
+          </w:p>
+        </w:tc>
+        <w:tc>
+          <w:tcPr/>
+          <w:p>
+            <w:pPr>
+              <w:pStyle w:val="Compact"/>
+              <w:jc w:val="left"/>
+            </w:pPr>
+            <w:r>
+              <w:t xml:space="preserve">React 18, TS 5.8, Vite 5.4</w:t>
+            </w:r>
+          </w:p>
+        </w:tc>
+      </w:tr>
+      <w:tr>
+        <w:tc>
+          <w:tcPr/>
+          <w:p>
+            <w:pPr>
+              <w:pStyle w:val="Compact"/>
+              <w:jc w:val="left"/>
+            </w:pPr>
+            <w:r>
+              <w:t xml:space="preserve">UI Framework</w:t>
+            </w:r>
+          </w:p>
+        </w:tc>
+        <w:tc>
+          <w:tcPr/>
+          <w:p>
+            <w:pPr>
+              <w:pStyle w:val="Compact"/>
+              <w:jc w:val="left"/>
+            </w:pPr>
+            <w:r>
+              <w:t xml:space="preserve">Tailwind CSS + shadcn/ui</w:t>
+            </w:r>
+          </w:p>
+        </w:tc>
+        <w:tc>
+          <w:tcPr/>
+          <w:p>
+            <w:pPr>
+              <w:pStyle w:val="Compact"/>
+              <w:jc w:val="left"/>
+            </w:pPr>
+            <w:r>
+              <w:t xml:space="preserve">Tailwind 3.4</w:t>
+            </w:r>
+          </w:p>
+        </w:tc>
+      </w:tr>
+      <w:tr>
+        <w:tc>
+          <w:tcPr/>
+          <w:p>
+            <w:pPr>
+              <w:pStyle w:val="Compact"/>
+              <w:jc w:val="left"/>
+            </w:pPr>
+            <w:r>
+              <w:t xml:space="preserve">Estado/Datos</w:t>
+            </w:r>
+          </w:p>
+        </w:tc>
+        <w:tc>
+          <w:tcPr/>
+          <w:p>
+            <w:pPr>
+              <w:pStyle w:val="Compact"/>
+              <w:jc w:val="left"/>
+            </w:pPr>
+            <w:r>
+              <w:t xml:space="preserve">TanStack React Query</w:t>
+            </w:r>
+          </w:p>
+        </w:tc>
+        <w:tc>
+          <w:tcPr/>
+          <w:p>
+            <w:pPr>
+              <w:pStyle w:val="Compact"/>
+              <w:jc w:val="left"/>
+            </w:pPr>
+            <w:r>
+              <w:t xml:space="preserve">5.83</w:t>
+            </w:r>
+          </w:p>
+        </w:tc>
+      </w:tr>
+      <w:tr>
+        <w:tc>
+          <w:tcPr/>
+          <w:p>
+            <w:pPr>
+              <w:pStyle w:val="Compact"/>
+              <w:jc w:val="left"/>
+            </w:pPr>
+            <w:r>
+              <w:t xml:space="preserve">Validación</w:t>
+            </w:r>
+          </w:p>
+        </w:tc>
+        <w:tc>
+          <w:tcPr/>
+          <w:p>
+            <w:pPr>
+              <w:pStyle w:val="Compact"/>
+              <w:jc w:val="left"/>
+            </w:pPr>
+            <w:r>
+              <w:t xml:space="preserve">Zod</w:t>
+            </w:r>
+          </w:p>
+        </w:tc>
+        <w:tc>
+          <w:tcPr/>
+          <w:p>
+            <w:pPr>
+              <w:pStyle w:val="Compact"/>
+              <w:jc w:val="left"/>
+            </w:pPr>
+            <w:r>
+              <w:t xml:space="preserve">3.25</w:t>
+            </w:r>
+          </w:p>
+        </w:tc>
+      </w:tr>
+      <w:tr>
+        <w:tc>
+          <w:tcPr/>
+          <w:p>
+            <w:pPr>
+              <w:pStyle w:val="Compact"/>
+              <w:jc w:val="left"/>
+            </w:pPr>
+            <w:r>
+              <w:t xml:space="preserve">Backend</w:t>
+            </w:r>
+          </w:p>
+        </w:tc>
+        <w:tc>
+          <w:tcPr/>
+          <w:p>
+            <w:pPr>
+              <w:pStyle w:val="Compact"/>
+              <w:jc w:val="left"/>
+            </w:pPr>
+            <w:r>
+              <w:t xml:space="preserve">Supabase (PostgreSQL + Auth + Realtime)</w:t>
+            </w:r>
+          </w:p>
+        </w:tc>
+        <w:tc>
+          <w:tcPr/>
+          <w:p>
+            <w:pPr>
+              <w:pStyle w:val="Compact"/>
+              <w:jc w:val="left"/>
+            </w:pPr>
+            <w:r>
+              <w:t xml:space="preserve">—</w:t>
+            </w:r>
+          </w:p>
+        </w:tc>
+      </w:tr>
+      <w:tr>
+        <w:tc>
+          <w:tcPr/>
+          <w:p>
+            <w:pPr>
+              <w:pStyle w:val="Compact"/>
+              <w:jc w:val="left"/>
+            </w:pPr>
+            <w:r>
+              <w:t xml:space="preserve">Hosting</w:t>
+            </w:r>
+          </w:p>
+        </w:tc>
+        <w:tc>
+          <w:tcPr/>
+          <w:p>
+            <w:pPr>
+              <w:pStyle w:val="Compact"/>
+              <w:jc w:val="left"/>
+            </w:pPr>
+            <w:r>
+              <w:t xml:space="preserve">Lovable / Vercel</w:t>
+            </w:r>
+          </w:p>
+        </w:tc>
+        <w:tc>
+          <w:tcPr/>
+          <w:p>
+            <w:pPr>
+              <w:pStyle w:val="Compact"/>
+              <w:jc w:val="left"/>
+            </w:pPr>
+            <w:r>
+              <w:t xml:space="preserve">—</w:t>
+            </w:r>
+          </w:p>
+        </w:tc>
+      </w:tr>
+    </w:tbl>
+    <w:p>
+      <w:pPr>
+        <w:pStyle w:val="BodyText"/>
+      </w:pPr>
       <w:r>
         <w:rPr>
           <w:iCs/>
           <w:i/>
         </w:rPr>
+        <w:t xml:space="preserve">Nota: El ESP32 forma parte exclusivamente del</w:t>
+      </w:r>
+      <w:r>
+        <w:rPr>
+          <w:iCs/>
+          <w:i/>
+        </w:rPr>
+        <w:t xml:space="preserve"> </w:t>
+      </w:r>
+      <w:r>
+        <w:rPr>
+          <w:bCs/>
+          <w:b/>
+          <w:iCs/>
+          <w:i/>
+        </w:rPr>
+        <w:t xml:space="preserve">alcance académico del Trabajo de Grado</w:t>
+      </w:r>
+      <w:r>
+        <w:rPr>
+          <w:iCs/>
+          <w:i/>
+        </w:rPr>
+        <w:t xml:space="preserve">, como herramienta de captura de eventos BLE para alimentar los reportes de la plataforma SARQUE. La operación productiva del parque puede realizarse sin el ESP32, programando los controladores BL-KR directamente desde la app móvil K-RainBL.</w:t>
+      </w:r>
+    </w:p>
+    <w:bookmarkEnd w:id="137"/>
+    <w:bookmarkStart w:id="138" w:name="a.6.-cobertura-y-disponibilidad-de-red"/>
+    <w:p>
+      <w:pPr>
+        <w:pStyle w:val="Heading3"/>
+      </w:pPr>
+      <w:r>
+        <w:rPr>
+          <w:rStyle w:val="SectionNumber"/>
+        </w:rPr>
+        <w:t xml:space="preserve">7.1.6</w:t>
+      </w:r>
+      <w:r>
+        <w:tab/>
+      </w:r>
+      <w:r>
+        <w:t xml:space="preserve">A.6. Cobertura y Disponibilidad de Red</w:t>
+      </w:r>
+    </w:p>
+    <w:tbl>
+      <w:tblPr>
+        <w:tblStyle w:val="Table"/>
+        <w:tblW w:type="pct" w:w="5000"/>
+        <w:tblLook w:firstRow="1" w:lastRow="0" w:firstColumn="0" w:lastColumn="0" w:noHBand="0" w:noVBand="0" w:val="0020"/>
+        <w:jc w:val="start"/>
+      </w:tblPr>
+      <w:tblGrid>
+        <w:gridCol w:w="4840"/>
+        <w:gridCol w:w="3080"/>
+      </w:tblGrid>
+      <w:tr>
+        <w:trPr>
+          <w:tblHeader w:val="true"/>
+        </w:trPr>
+        <w:tc>
+          <w:tcPr/>
+          <w:p>
+            <w:pPr>
+              <w:pStyle w:val="Compact"/>
+              <w:jc w:val="left"/>
+            </w:pPr>
+            <w:r>
+              <w:t xml:space="preserve">Parámetro</w:t>
+            </w:r>
+          </w:p>
+        </w:tc>
+        <w:tc>
+          <w:tcPr/>
+          <w:p>
+            <w:pPr>
+              <w:pStyle w:val="Compact"/>
+              <w:jc w:val="left"/>
+            </w:pPr>
+            <w:r>
+              <w:t xml:space="preserve">Valor</w:t>
+            </w:r>
+          </w:p>
+        </w:tc>
+      </w:tr>
+      <w:tr>
+        <w:tc>
+          <w:tcPr/>
+          <w:p>
+            <w:pPr>
+              <w:pStyle w:val="Compact"/>
+              <w:jc w:val="left"/>
+            </w:pPr>
+            <w:r>
+              <w:t xml:space="preserve">Red WiFi</w:t>
+            </w:r>
+          </w:p>
+        </w:tc>
+        <w:tc>
+          <w:tcPr/>
+          <w:p>
+            <w:pPr>
+              <w:pStyle w:val="Compact"/>
+              <w:jc w:val="left"/>
+            </w:pPr>
+            <w:r>
+              <w:t xml:space="preserve">2.4 GHz, disponible en la caseta de la bomba</w:t>
+            </w:r>
+          </w:p>
+        </w:tc>
+      </w:tr>
+      <w:tr>
+        <w:tc>
+          <w:tcPr/>
+          <w:p>
+            <w:pPr>
+              <w:pStyle w:val="Compact"/>
+              <w:jc w:val="left"/>
+            </w:pPr>
+            <w:r>
+              <w:t xml:space="preserve">Ubicación del ESP32 (prototipo)</w:t>
+            </w:r>
+          </w:p>
+        </w:tc>
+        <w:tc>
+          <w:tcPr/>
+          <w:p>
+            <w:pPr>
+              <w:pStyle w:val="Compact"/>
+              <w:jc w:val="left"/>
+            </w:pPr>
+            <w:r>
+              <w:t xml:space="preserve">Caseta de máquinas de la bomba</w:t>
+            </w:r>
+          </w:p>
+        </w:tc>
+      </w:tr>
+      <w:tr>
+        <w:tc>
+          <w:tcPr/>
+          <w:p>
+            <w:pPr>
+              <w:pStyle w:val="Compact"/>
+              <w:jc w:val="left"/>
+            </w:pPr>
+            <w:r>
+              <w:t xml:space="preserve">Alcance BLE estimado</w:t>
+            </w:r>
+          </w:p>
+        </w:tc>
+        <w:tc>
+          <w:tcPr/>
+          <w:p>
+            <w:pPr>
+              <w:pStyle w:val="Compact"/>
+              <w:jc w:val="left"/>
+            </w:pPr>
+            <w:r>
+              <w:t xml:space="preserve">10-15 metros en condiciones reales con vegetación</w:t>
+            </w:r>
+          </w:p>
+        </w:tc>
+      </w:tr>
+    </w:tbl>
+    <w:p>
+      <w:r>
+        <w:pict>
+          <v:rect style="width:0;height:1.5pt" o:hralign="center" o:hrstd="t" o:hr="t"/>
+        </w:pict>
+      </w:r>
+    </w:p>
+    <w:bookmarkEnd w:id="138"/>
+    <w:bookmarkEnd w:id="139"/>
+    <w:bookmarkStart w:id="147" w:name="X5d8879f9e725364a517060818c67c89b91edc68"/>
+    <w:p>
+      <w:pPr>
+        <w:pStyle w:val="Heading2"/>
+      </w:pPr>
+      <w:r>
+        <w:rPr>
+          <w:rStyle w:val="SectionNumber"/>
+        </w:rPr>
+        <w:t xml:space="preserve">7.2</w:t>
+      </w:r>
+      <w:r>
+        <w:tab/>
+      </w:r>
+      <w:r>
+        <w:t xml:space="preserve">ANEXO B — GALERÍA FOTOGRÁFICA DE LA INSTALACIÓN</w:t>
+      </w:r>
+    </w:p>
+    <w:p>
+      <w:pPr>
+        <w:pStyle w:val="FirstParagraph"/>
+      </w:pPr>
+      <w:r>
+        <w:t xml:space="preserve">Este anexo recopila las fotografías documentales del proceso de instalación del sistema SARQUE en el Parque Ecoturístico Quinta Estación. Las imágenes evidencian el estado real del trabajo de campo y respaldan las especificaciones técnicas del Anexo A.</w:t>
+      </w:r>
+    </w:p>
+    <w:bookmarkStart w:id="140" w:name="b.1.-planimetría-del-parque"/>
+    <w:p>
+      <w:pPr>
+        <w:pStyle w:val="Heading3"/>
+      </w:pPr>
+      <w:r>
+        <w:rPr>
+          <w:rStyle w:val="SectionNumber"/>
+        </w:rPr>
+        <w:t xml:space="preserve">7.2.1</w:t>
+      </w:r>
+      <w:r>
+        <w:tab/>
+      </w:r>
+      <w:r>
+        <w:t xml:space="preserve">B.1. Planimetría del Parque</w:t>
+      </w:r>
+    </w:p>
+    <w:p>
+      <w:pPr>
+        <w:numPr>
+          <w:ilvl w:val="0"/>
+          <w:numId w:val="1018"/>
+        </w:numPr>
+        <w:pStyle w:val="Compact"/>
+      </w:pPr>
+      <w:r>
+        <w:rPr>
+          <w:bCs/>
+          <w:b/>
+        </w:rPr>
+        <w:t xml:space="preserve">Foto B.1.</w:t>
+      </w:r>
+      <w:r>
+        <w:t xml:space="preserve"> </w:t>
+      </w:r>
+      <w:r>
+        <w:t xml:space="preserve">Plano General del parque (escala 1:250) con la red hidráulica anotada manualmente: trazos de colores indican las cañerías de cada sector, los puntos dorados representan las ubicaciones de los 41 puntos de riego (consolidados en 22 estaciones controladas).</w:t>
+      </w:r>
+    </w:p>
+    <w:p>
+      <w:pPr>
+        <w:numPr>
+          <w:ilvl w:val="0"/>
+          <w:numId w:val="1018"/>
+        </w:numPr>
+        <w:pStyle w:val="Compact"/>
+      </w:pPr>
+      <w:r>
+        <w:rPr>
+          <w:bCs/>
+          <w:b/>
+        </w:rPr>
+        <w:t xml:space="preserve">Foto B.2.</w:t>
+      </w:r>
+      <w:r>
+        <w:t xml:space="preserve"> </w:t>
+      </w:r>
+      <w:r>
+        <w:t xml:space="preserve">Cronograma semanal de riego utilizado actualmente por los jardineros, organizado por franjas horarias de 8:00 a 20:00 y por sector.</w:t>
+      </w:r>
+    </w:p>
+    <w:bookmarkEnd w:id="140"/>
+    <w:bookmarkStart w:id="141" w:name="b.2.-sistema-de-bombeo-existente"/>
+    <w:p>
+      <w:pPr>
+        <w:pStyle w:val="Heading3"/>
+      </w:pPr>
+      <w:r>
+        <w:rPr>
+          <w:rStyle w:val="SectionNumber"/>
+        </w:rPr>
+        <w:t xml:space="preserve">7.2.2</w:t>
+      </w:r>
+      <w:r>
+        <w:tab/>
+      </w:r>
+      <w:r>
+        <w:t xml:space="preserve">B.2. Sistema de Bombeo Existente</w:t>
+      </w:r>
+    </w:p>
+    <w:p>
+      <w:pPr>
+        <w:numPr>
+          <w:ilvl w:val="0"/>
+          <w:numId w:val="1019"/>
+        </w:numPr>
+        <w:pStyle w:val="Compact"/>
+      </w:pPr>
+      <w:r>
+        <w:rPr>
+          <w:bCs/>
+          <w:b/>
+        </w:rPr>
+        <w:t xml:space="preserve">Foto B.3.</w:t>
+      </w:r>
+      <w:r>
+        <w:t xml:space="preserve"> </w:t>
+      </w:r>
+      <w:r>
+        <w:t xml:space="preserve">Salida de la bomba sumergible Grundfos 5 HP con manómetro de presión, tanque hidroneumático y matriz principal de 2” en PVC y acero galvanizado (caseta de máquinas).</w:t>
+      </w:r>
+    </w:p>
+    <w:p>
+      <w:pPr>
+        <w:numPr>
+          <w:ilvl w:val="0"/>
+          <w:numId w:val="1019"/>
+        </w:numPr>
+        <w:pStyle w:val="Compact"/>
+      </w:pPr>
+      <w:r>
+        <w:rPr>
+          <w:bCs/>
+          <w:b/>
+        </w:rPr>
+        <w:t xml:space="preserve">Foto B.4.</w:t>
+      </w:r>
+      <w:r>
+        <w:t xml:space="preserve"> </w:t>
+      </w:r>
+      <w:r>
+        <w:t xml:space="preserve">Vista interna de la caseta de bombeo con válvulas de control, manómetro analógico y tubería matriz hacia el parque.</w:t>
+      </w:r>
+    </w:p>
+    <w:bookmarkEnd w:id="141"/>
+    <w:bookmarkStart w:id="142" w:name="b.3.-excavación-y-tendido-del-politubo"/>
+    <w:p>
+      <w:pPr>
+        <w:pStyle w:val="Heading3"/>
+      </w:pPr>
+      <w:r>
+        <w:rPr>
+          <w:rStyle w:val="SectionNumber"/>
+        </w:rPr>
+        <w:t xml:space="preserve">7.2.3</w:t>
+      </w:r>
+      <w:r>
+        <w:tab/>
+      </w:r>
+      <w:r>
+        <w:t xml:space="preserve">B.3. Excavación y Tendido del Politubo</w:t>
+      </w:r>
+    </w:p>
+    <w:p>
+      <w:pPr>
+        <w:numPr>
+          <w:ilvl w:val="0"/>
+          <w:numId w:val="1020"/>
+        </w:numPr>
+        <w:pStyle w:val="Compact"/>
+      </w:pPr>
+      <w:r>
+        <w:rPr>
+          <w:bCs/>
+          <w:b/>
+        </w:rPr>
+        <w:t xml:space="preserve">Foto B.5.</w:t>
+      </w:r>
+      <w:r>
+        <w:t xml:space="preserve"> </w:t>
+      </w:r>
+      <w:r>
+        <w:t xml:space="preserve">Zanja excavada a 20-25 cm de profundidad para el tendido del politubo de 3/4” que aloja el cable monofilar 20 AWG.</w:t>
+      </w:r>
+    </w:p>
+    <w:p>
+      <w:pPr>
+        <w:numPr>
+          <w:ilvl w:val="0"/>
+          <w:numId w:val="1020"/>
+        </w:numPr>
+        <w:pStyle w:val="Compact"/>
+      </w:pPr>
+      <w:r>
+        <w:rPr>
+          <w:bCs/>
+          <w:b/>
+        </w:rPr>
+        <w:t xml:space="preserve">Foto B.6.</w:t>
+      </w:r>
+      <w:r>
+        <w:t xml:space="preserve"> </w:t>
+      </w:r>
+      <w:r>
+        <w:t xml:space="preserve">Tendido del politubo negro entre sectores, atravesando áreas de césped y vegetación nativa (suculentas, jardín de cítricos).</w:t>
+      </w:r>
+    </w:p>
+    <w:p>
+      <w:pPr>
+        <w:numPr>
+          <w:ilvl w:val="0"/>
+          <w:numId w:val="1020"/>
+        </w:numPr>
+        <w:pStyle w:val="Compact"/>
+      </w:pPr>
+      <w:r>
+        <w:rPr>
+          <w:bCs/>
+          <w:b/>
+        </w:rPr>
+        <w:t xml:space="preserve">Foto B.7.</w:t>
+      </w:r>
+      <w:r>
+        <w:t xml:space="preserve"> </w:t>
+      </w:r>
+      <w:r>
+        <w:t xml:space="preserve">Detalle de cable 20 AWG saliendo del politubo en zanja paralela a la tubería hidráulica.</w:t>
+      </w:r>
+    </w:p>
+    <w:p>
+      <w:pPr>
+        <w:numPr>
+          <w:ilvl w:val="0"/>
+          <w:numId w:val="1020"/>
+        </w:numPr>
+        <w:pStyle w:val="Compact"/>
+      </w:pPr>
+      <w:r>
+        <w:rPr>
+          <w:bCs/>
+          <w:b/>
+        </w:rPr>
+        <w:t xml:space="preserve">Foto B.8.</w:t>
+      </w:r>
+      <w:r>
+        <w:t xml:space="preserve"> </w:t>
+      </w:r>
+      <w:r>
+        <w:t xml:space="preserve">Técnica de excavación con preservación del césped: corte vertical con pala plana para reponer el tepe tras el tendido.</w:t>
+      </w:r>
+    </w:p>
+    <w:bookmarkEnd w:id="142"/>
+    <w:bookmarkStart w:id="143" w:name="b.4.-electroválvulas-k-rain-bspt"/>
+    <w:p>
+      <w:pPr>
+        <w:pStyle w:val="Heading3"/>
+      </w:pPr>
+      <w:r>
+        <w:rPr>
+          <w:rStyle w:val="SectionNumber"/>
+        </w:rPr>
+        <w:t xml:space="preserve">7.2.4</w:t>
+      </w:r>
+      <w:r>
+        <w:tab/>
+      </w:r>
+      <w:r>
+        <w:t xml:space="preserve">B.4. Electroválvulas K-Rain BSPT</w:t>
+      </w:r>
+    </w:p>
+    <w:p>
+      <w:pPr>
+        <w:numPr>
+          <w:ilvl w:val="0"/>
+          <w:numId w:val="1021"/>
+        </w:numPr>
+        <w:pStyle w:val="Compact"/>
+      </w:pPr>
+      <w:r>
+        <w:rPr>
+          <w:bCs/>
+          <w:b/>
+        </w:rPr>
+        <w:t xml:space="preserve">Foto B.9.</w:t>
+      </w:r>
+      <w:r>
+        <w:t xml:space="preserve"> </w:t>
+      </w:r>
+      <w:r>
+        <w:t xml:space="preserve">Electroválvula K-Rain BSPT 9V DC instalada en línea con cuellera PVC 1 ½”, solenoide visible con cables rojo (+) y negro (-), llave de paso roja manual de respaldo.</w:t>
+      </w:r>
+    </w:p>
+    <w:p>
+      <w:pPr>
+        <w:numPr>
+          <w:ilvl w:val="0"/>
+          <w:numId w:val="1021"/>
+        </w:numPr>
+        <w:pStyle w:val="Compact"/>
+      </w:pPr>
+      <w:r>
+        <w:rPr>
+          <w:bCs/>
+          <w:b/>
+        </w:rPr>
+        <w:t xml:space="preserve">Foto B.10.</w:t>
+      </w:r>
+      <w:r>
+        <w:t xml:space="preserve"> </w:t>
+      </w:r>
+      <w:r>
+        <w:t xml:space="preserve">Electroválvula recientemente conectada a la red, con conexiones impermeabilizadas mediante cinta autovulcanizante.</w:t>
+      </w:r>
+    </w:p>
+    <w:p>
+      <w:pPr>
+        <w:numPr>
+          <w:ilvl w:val="0"/>
+          <w:numId w:val="1021"/>
+        </w:numPr>
+        <w:pStyle w:val="Compact"/>
+      </w:pPr>
+      <w:r>
+        <w:rPr>
+          <w:bCs/>
+          <w:b/>
+        </w:rPr>
+        <w:t xml:space="preserve">Foto B.11.</w:t>
+      </w:r>
+      <w:r>
+        <w:t xml:space="preserve"> </w:t>
+      </w:r>
+      <w:r>
+        <w:t xml:space="preserve">Detalle del solenoide de la electroválvula con los cables del controlador BL-KR.</w:t>
+      </w:r>
+    </w:p>
+    <w:bookmarkEnd w:id="143"/>
+    <w:bookmarkStart w:id="144" w:name="b.5.-cajas-de-válvula"/>
+    <w:p>
+      <w:pPr>
+        <w:pStyle w:val="Heading3"/>
+      </w:pPr>
+      <w:r>
+        <w:rPr>
+          <w:rStyle w:val="SectionNumber"/>
+        </w:rPr>
+        <w:t xml:space="preserve">7.2.5</w:t>
+      </w:r>
+      <w:r>
+        <w:tab/>
+      </w:r>
+      <w:r>
+        <w:t xml:space="preserve">B.5. Cajas de Válvula</w:t>
+      </w:r>
+    </w:p>
+    <w:p>
+      <w:pPr>
+        <w:numPr>
+          <w:ilvl w:val="0"/>
+          <w:numId w:val="1022"/>
+        </w:numPr>
+        <w:pStyle w:val="Compact"/>
+      </w:pPr>
+      <w:r>
+        <w:rPr>
+          <w:bCs/>
+          <w:b/>
+        </w:rPr>
+        <w:t xml:space="preserve">Foto B.12.</w:t>
+      </w:r>
+      <w:r>
+        <w:t xml:space="preserve"> </w:t>
+      </w:r>
+      <w:r>
+        <w:t xml:space="preserve">Caja de válvula de hormigón armado 40 × 40 × 30 cm alojando una electroválvula y la conexión de respaldo manual.</w:t>
+      </w:r>
+    </w:p>
+    <w:p>
+      <w:pPr>
+        <w:numPr>
+          <w:ilvl w:val="0"/>
+          <w:numId w:val="1022"/>
+        </w:numPr>
+        <w:pStyle w:val="Compact"/>
+      </w:pPr>
+      <w:r>
+        <w:rPr>
+          <w:bCs/>
+          <w:b/>
+        </w:rPr>
+        <w:t xml:space="preserve">Foto B.13.</w:t>
+      </w:r>
+      <w:r>
+        <w:t xml:space="preserve"> </w:t>
+      </w:r>
+      <w:r>
+        <w:t xml:space="preserve">Caja de válvula circular tipo</w:t>
+      </w:r>
+      <w:r>
+        <w:t xml:space="preserve"> </w:t>
+      </w:r>
+      <w:r>
+        <w:t xml:space="preserve">“</w:t>
+      </w:r>
+      <w:r>
+        <w:t xml:space="preserve">round valve box</w:t>
+      </w:r>
+      <w:r>
+        <w:t xml:space="preserve">”</w:t>
+      </w:r>
+      <w:r>
+        <w:t xml:space="preserve"> </w:t>
+      </w:r>
+      <w:r>
+        <w:t xml:space="preserve">con múltiples conectores impermeabilizados de cables hacia varios solenoides (configuración para BL-KR4 o BL-KR6).</w:t>
+      </w:r>
+    </w:p>
+    <w:bookmarkEnd w:id="144"/>
+    <w:bookmarkStart w:id="145" w:name="b.6.-empalmes-y-conexiones-eléctricas"/>
+    <w:p>
+      <w:pPr>
+        <w:pStyle w:val="Heading3"/>
+      </w:pPr>
+      <w:r>
+        <w:rPr>
+          <w:rStyle w:val="SectionNumber"/>
+        </w:rPr>
+        <w:t xml:space="preserve">7.2.6</w:t>
+      </w:r>
+      <w:r>
+        <w:tab/>
+      </w:r>
+      <w:r>
+        <w:t xml:space="preserve">B.6. Empalmes y Conexiones Eléctricas</w:t>
+      </w:r>
+    </w:p>
+    <w:p>
+      <w:pPr>
+        <w:numPr>
+          <w:ilvl w:val="0"/>
+          <w:numId w:val="1023"/>
+        </w:numPr>
+        <w:pStyle w:val="Compact"/>
+      </w:pPr>
+      <w:r>
+        <w:rPr>
+          <w:bCs/>
+          <w:b/>
+        </w:rPr>
+        <w:t xml:space="preserve">Foto B.14.</w:t>
+      </w:r>
+      <w:r>
+        <w:t xml:space="preserve"> </w:t>
+      </w:r>
+      <w:r>
+        <w:t xml:space="preserve">Empalmes impermeabilizados de cables 20 AWG (rojo/negro/naranja) en el interior de una caja de registro circular, evidenciando la organización del cableado entre el controlador y sus estaciones.</w:t>
+      </w:r>
+    </w:p>
+    <w:p>
+      <w:pPr>
+        <w:numPr>
+          <w:ilvl w:val="0"/>
+          <w:numId w:val="1023"/>
+        </w:numPr>
+        <w:pStyle w:val="Compact"/>
+      </w:pPr>
+      <w:r>
+        <w:rPr>
+          <w:bCs/>
+          <w:b/>
+        </w:rPr>
+        <w:t xml:space="preserve">Foto B.15.</w:t>
+      </w:r>
+      <w:r>
+        <w:t xml:space="preserve"> </w:t>
+      </w:r>
+      <w:r>
+        <w:t xml:space="preserve">Detalle del empalme entre el cable común y las salidas a estaciones del controlador BL-KR.</w:t>
+      </w:r>
+    </w:p>
+    <w:bookmarkEnd w:id="145"/>
+    <w:bookmarkStart w:id="146" w:name="b.7.-componentes-en-stock"/>
+    <w:p>
+      <w:pPr>
+        <w:pStyle w:val="Heading3"/>
+      </w:pPr>
+      <w:r>
+        <w:rPr>
+          <w:rStyle w:val="SectionNumber"/>
+        </w:rPr>
+        <w:t xml:space="preserve">7.2.7</w:t>
+      </w:r>
+      <w:r>
+        <w:tab/>
+      </w:r>
+      <w:r>
+        <w:t xml:space="preserve">B.7. Componentes en Stock</w:t>
+      </w:r>
+    </w:p>
+    <w:p>
+      <w:pPr>
+        <w:numPr>
+          <w:ilvl w:val="0"/>
+          <w:numId w:val="1024"/>
+        </w:numPr>
+        <w:pStyle w:val="Compact"/>
+      </w:pPr>
+      <w:r>
+        <w:rPr>
+          <w:bCs/>
+          <w:b/>
+        </w:rPr>
+        <w:t xml:space="preserve">Foto B.16.</w:t>
+      </w:r>
+      <w:r>
+        <w:t xml:space="preserve"> </w:t>
+      </w:r>
+      <w:r>
+        <w:t xml:space="preserve">Rollos de cable 20 AWG monofilar (color rojo y negro) listos para la instalación, junto al solenoide de una electroválvula K-Rain.</w:t>
+      </w:r>
+    </w:p>
+    <w:p>
+      <w:r>
+        <w:pict>
+          <v:rect style="width:0;height:1.5pt" o:hralign="center" o:hrstd="t" o:hr="t"/>
+        </w:pict>
+      </w:r>
+    </w:p>
+    <w:bookmarkEnd w:id="146"/>
+    <w:bookmarkEnd w:id="147"/>
+    <w:bookmarkStart w:id="150" w:name="Xb2d2751107430640be2769cc6726838da7f66a5"/>
+    <w:p>
+      <w:pPr>
+        <w:pStyle w:val="Heading2"/>
+      </w:pPr>
+      <w:r>
+        <w:rPr>
+          <w:rStyle w:val="SectionNumber"/>
+        </w:rPr>
+        <w:t xml:space="preserve">7.3</w:t>
+      </w:r>
+      <w:r>
+        <w:tab/>
+      </w:r>
+      <w:r>
+        <w:t xml:space="preserve">ANEXO C — CONFIGURACIÓN INICIAL DE LOS CONTROLADORES</w:t>
+      </w:r>
+    </w:p>
+    <w:bookmarkStart w:id="148" w:name="c.1.-programación-desde-la-app-k-rainbl"/>
+    <w:p>
+      <w:pPr>
+        <w:pStyle w:val="Heading3"/>
+      </w:pPr>
+      <w:r>
+        <w:rPr>
+          <w:rStyle w:val="SectionNumber"/>
+        </w:rPr>
+        <w:t xml:space="preserve">7.3.1</w:t>
+      </w:r>
+      <w:r>
+        <w:tab/>
+      </w:r>
+      <w:r>
+        <w:t xml:space="preserve">C.1. Programación desde la App K-RainBL</w:t>
+      </w:r>
+    </w:p>
+    <w:p>
+      <w:pPr>
+        <w:numPr>
+          <w:ilvl w:val="0"/>
+          <w:numId w:val="1025"/>
+        </w:numPr>
+        <w:pStyle w:val="Compact"/>
+      </w:pPr>
+      <w:r>
+        <w:t xml:space="preserve">Descargar la app</w:t>
+      </w:r>
+      <w:r>
+        <w:t xml:space="preserve"> </w:t>
+      </w:r>
+      <w:r>
+        <w:rPr>
+          <w:bCs/>
+          <w:b/>
+        </w:rPr>
+        <w:t xml:space="preserve">K-RainBL</w:t>
+      </w:r>
+      <w:r>
+        <w:t xml:space="preserve"> </w:t>
+      </w:r>
+      <w:r>
+        <w:t xml:space="preserve">desde App Store (iOS) o Google Play (Android).</w:t>
+      </w:r>
+    </w:p>
+    <w:p>
+      <w:pPr>
+        <w:numPr>
+          <w:ilvl w:val="0"/>
+          <w:numId w:val="1025"/>
+        </w:numPr>
+        <w:pStyle w:val="Compact"/>
+      </w:pPr>
+      <w:r>
+        <w:t xml:space="preserve">Acercarse al controlador con el teléfono (alcance Bluetooth &lt; 10 m).</w:t>
+      </w:r>
+    </w:p>
+    <w:p>
+      <w:pPr>
+        <w:numPr>
+          <w:ilvl w:val="0"/>
+          <w:numId w:val="1025"/>
+        </w:numPr>
+        <w:pStyle w:val="Compact"/>
+      </w:pPr>
+      <w:r>
+        <w:t xml:space="preserve">La app detecta automáticamente el controlador y solicita emparejamiento.</w:t>
+      </w:r>
+    </w:p>
+    <w:p>
+      <w:pPr>
+        <w:numPr>
+          <w:ilvl w:val="0"/>
+          <w:numId w:val="1025"/>
+        </w:numPr>
+        <w:pStyle w:val="Compact"/>
+      </w:pPr>
+      <w:r>
+        <w:t xml:space="preserve">En el menú</w:t>
+      </w:r>
+      <w:r>
+        <w:t xml:space="preserve"> </w:t>
+      </w:r>
+      <w:r>
+        <w:rPr>
+          <w:bCs/>
+          <w:b/>
+        </w:rPr>
+        <w:t xml:space="preserve">Schedules</w:t>
+      </w:r>
+      <w:r>
+        <w:t xml:space="preserve">, crear un horario por estación con: día de la semana, hora de inicio, duración.</w:t>
+      </w:r>
+    </w:p>
+    <w:p>
+      <w:pPr>
+        <w:numPr>
+          <w:ilvl w:val="0"/>
+          <w:numId w:val="1025"/>
+        </w:numPr>
+        <w:pStyle w:val="Compact"/>
+      </w:pPr>
+      <w:r>
+        <w:t xml:space="preserve">Sincronizar el horario con el controlador (botón</w:t>
+      </w:r>
+      <w:r>
+        <w:t xml:space="preserve"> </w:t>
+      </w:r>
+      <w:r>
+        <w:rPr>
+          <w:bCs/>
+          <w:b/>
+        </w:rPr>
+        <w:t xml:space="preserve">Sync</w:t>
+      </w:r>
+      <w:r>
+        <w:t xml:space="preserve">).</w:t>
+      </w:r>
+    </w:p>
+    <w:bookmarkEnd w:id="148"/>
+    <w:bookmarkStart w:id="149" w:name="X445b82d5987c1aa8320a6b363855121fc48faca"/>
+    <w:p>
+      <w:pPr>
+        <w:pStyle w:val="Heading3"/>
+      </w:pPr>
+      <w:r>
+        <w:rPr>
+          <w:rStyle w:val="SectionNumber"/>
+        </w:rPr>
+        <w:t xml:space="preserve">7.3.2</w:t>
+      </w:r>
+      <w:r>
+        <w:tab/>
+      </w:r>
+      <w:r>
+        <w:t xml:space="preserve">C.2. Inicialización del ESP32 (alcance académico)</w:t>
+      </w:r>
+    </w:p>
+    <w:p>
+      <w:pPr>
+        <w:numPr>
+          <w:ilvl w:val="0"/>
+          <w:numId w:val="1026"/>
+        </w:numPr>
+        <w:pStyle w:val="Compact"/>
+      </w:pPr>
+      <w:r>
+        <w:t xml:space="preserve">Conectar el ESP32 a la red WiFi mediante archivo</w:t>
+      </w:r>
+      <w:r>
+        <w:t xml:space="preserve"> </w:t>
+      </w:r>
+      <w:r>
+        <w:rPr>
+          <w:rStyle w:val="VerbatimChar"/>
+        </w:rPr>
+        <w:t xml:space="preserve">secrets.h</w:t>
+      </w:r>
+      <w:r>
+        <w:t xml:space="preserve"> </w:t>
+      </w:r>
+      <w:r>
+        <w:t xml:space="preserve">(SSID + password).</w:t>
+      </w:r>
+    </w:p>
+    <w:p>
+      <w:pPr>
+        <w:numPr>
+          <w:ilvl w:val="0"/>
+          <w:numId w:val="1026"/>
+        </w:numPr>
+        <w:pStyle w:val="Compact"/>
+      </w:pPr>
+      <w:r>
+        <w:t xml:space="preserve">Configurar la URL del proyecto Supabase y la API key en el firmware.</w:t>
+      </w:r>
+    </w:p>
+    <w:p>
+      <w:pPr>
+        <w:numPr>
+          <w:ilvl w:val="0"/>
+          <w:numId w:val="1026"/>
+        </w:numPr>
+        <w:pStyle w:val="Compact"/>
+      </w:pPr>
+      <w:r>
+        <w:t xml:space="preserve">Cargar el firmware desde Arduino IDE con la librería NimBLE-Arduino instalada.</w:t>
+      </w:r>
+    </w:p>
+    <w:p>
+      <w:pPr>
+        <w:numPr>
+          <w:ilvl w:val="0"/>
+          <w:numId w:val="1026"/>
+        </w:numPr>
+        <w:pStyle w:val="Compact"/>
+      </w:pPr>
+      <w:r>
+        <w:t xml:space="preserve">El LED verde se enciende al conectar WiFi; el LED azul parpadea al detectar un BL-KR cercano.</w:t>
+      </w:r>
+    </w:p>
+    <w:p>
+      <w:r>
+        <w:pict>
+          <v:rect style="width:0;height:1.5pt" o:hralign="center" o:hrstd="t" o:hr="t"/>
+        </w:pict>
+      </w:r>
+    </w:p>
+    <w:p>
+      <w:pPr>
+        <w:pStyle w:val="FirstParagraph"/>
+      </w:pPr>
+      <w:r>
+        <w:rPr>
+          <w:iCs/>
+          <w:i/>
+        </w:rPr>
+        <w:t xml:space="preserve">Documento generado para el Trabajo de Grado — Instituto Tecnológico Superior de Sacaba (ITSa)</w:t>
+      </w:r>
+      <w:r>
+        <w:t xml:space="preserve"> </w:t>
+      </w:r>
+      <w:r>
+        <w:rPr>
+          <w:iCs/>
+          <w:i/>
+        </w:rPr>
         <w:t xml:space="preserve">Carrera de Informática Industrial — 2026</w:t>
       </w:r>
-    </w:p>
-    <w:bookmarkEnd w:id="131"/>
-    <w:bookmarkEnd w:id="132"/>
+      <w:r>
+        <w:t xml:space="preserve"> </w:t>
+      </w:r>
+      <w:r>
+        <w:rPr>
+          <w:iCs/>
+          <w:i/>
+        </w:rPr>
+        <w:t xml:space="preserve">Postulante: Jose Neyer Arnez Aguilar — Tutor: Ing. Ariel Luis Gruich Arratia</w:t>
+      </w:r>
+    </w:p>
+    <w:bookmarkEnd w:id="149"/>
+    <w:bookmarkEnd w:id="150"/>
+    <w:bookmarkEnd w:id="151"/>
     <w:sectPr/>
   </w:body>
 </w:document>
@@ -15937,6 +18796,87 @@
   </w:num>
   <w:num w:numId="1017">
     <w:abstractNumId w:val="991"/>
+  </w:num>
+  <w:num w:numId="1018">
+    <w:abstractNumId w:val="991"/>
+  </w:num>
+  <w:num w:numId="1019">
+    <w:abstractNumId w:val="991"/>
+  </w:num>
+  <w:num w:numId="1020">
+    <w:abstractNumId w:val="991"/>
+  </w:num>
+  <w:num w:numId="1021">
+    <w:abstractNumId w:val="991"/>
+  </w:num>
+  <w:num w:numId="1022">
+    <w:abstractNumId w:val="991"/>
+  </w:num>
+  <w:num w:numId="1023">
+    <w:abstractNumId w:val="991"/>
+  </w:num>
+  <w:num w:numId="1024">
+    <w:abstractNumId w:val="991"/>
+  </w:num>
+  <w:num w:numId="1025">
+    <w:abstractNumId w:val="99411"/>
+    <w:lvlOverride w:ilvl="0">
+      <w:startOverride w:val="1"/>
+    </w:lvlOverride>
+    <w:lvlOverride w:ilvl="1">
+      <w:startOverride w:val="1"/>
+    </w:lvlOverride>
+    <w:lvlOverride w:ilvl="2">
+      <w:startOverride w:val="1"/>
+    </w:lvlOverride>
+    <w:lvlOverride w:ilvl="3">
+      <w:startOverride w:val="1"/>
+    </w:lvlOverride>
+    <w:lvlOverride w:ilvl="4">
+      <w:startOverride w:val="1"/>
+    </w:lvlOverride>
+    <w:lvlOverride w:ilvl="5">
+      <w:startOverride w:val="1"/>
+    </w:lvlOverride>
+    <w:lvlOverride w:ilvl="6">
+      <w:startOverride w:val="1"/>
+    </w:lvlOverride>
+    <w:lvlOverride w:ilvl="7">
+      <w:startOverride w:val="1"/>
+    </w:lvlOverride>
+    <w:lvlOverride w:ilvl="8">
+      <w:startOverride w:val="1"/>
+    </w:lvlOverride>
+  </w:num>
+  <w:num w:numId="1026">
+    <w:abstractNumId w:val="99411"/>
+    <w:lvlOverride w:ilvl="0">
+      <w:startOverride w:val="1"/>
+    </w:lvlOverride>
+    <w:lvlOverride w:ilvl="1">
+      <w:startOverride w:val="1"/>
+    </w:lvlOverride>
+    <w:lvlOverride w:ilvl="2">
+      <w:startOverride w:val="1"/>
+    </w:lvlOverride>
+    <w:lvlOverride w:ilvl="3">
+      <w:startOverride w:val="1"/>
+    </w:lvlOverride>
+    <w:lvlOverride w:ilvl="4">
+      <w:startOverride w:val="1"/>
+    </w:lvlOverride>
+    <w:lvlOverride w:ilvl="5">
+      <w:startOverride w:val="1"/>
+    </w:lvlOverride>
+    <w:lvlOverride w:ilvl="6">
+      <w:startOverride w:val="1"/>
+    </w:lvlOverride>
+    <w:lvlOverride w:ilvl="7">
+      <w:startOverride w:val="1"/>
+    </w:lvlOverride>
+    <w:lvlOverride w:ilvl="8">
+      <w:startOverride w:val="1"/>
+    </w:lvlOverride>
   </w:num>
 </w:numbering>
 </file>

</xml_diff>

<commit_message>
App de visualizacion pura: Dashboard tiempo real, Cronograma editable, Reportes, Sectores
</commit_message>
<xml_diff>
--- a/SARQUE_documento.docx
+++ b/SARQUE_documento.docx
@@ -877,7 +877,7 @@
         <w:pStyle w:val="BodyText"/>
       </w:pPr>
       <w:r>
-        <w:t xml:space="preserve">El parque emplea a 6 jardineros y 1 administrador, bajo la dirección de la propietaria. El sistema de riego actual funciona mediante una bomba sumergible Grundfos de 5 HP trifásica instalada en un pozo de 50 metros de profundidad, con un caudal medido de 4.2 litros por segundo y un tanque hidroneumático que opera entre 3.5 y 4.0 bar. La bomba es capaz de mantener activa una sola zona de riego a la vez. El agua se distribuye desde la matriz principal de 2” en PVC a través de cuelleras de 1 ½” hacia 41 puntos de riego históricos distribuidos en el predio —representados en el Plano General a escala 1:250 como puntos de color dorado—, cada uno de los cuales debía ser abierto y cerrado manualmente por el personal en cada ciclo de riego.</w:t>
+        <w:t xml:space="preserve">El parque emplea a 6 jardineros y 1 administrador, bajo la dirección de la propietaria. El sistema de riego actual funciona mediante una bomba sumergible Grundfos de 5 HP trifásica instalada en un pozo de 50 metros de profundidad, con un caudal medido de 4 litros por segundo y un tanque hidroneumático que opera entre 3.5 y 4.0 bar. La bomba es capaz de mantener activa una sola zona de riego a la vez. El agua se distribuye desde la matriz principal de 2” en PVC a través de cuelleras de 1 ½” hacia 41 puntos de riego históricos distribuidos en el predio —representados en el Plano General a escala 1:250 como puntos de color dorado—, cada uno de los cuales debía ser abierto y cerrado manualmente por el personal en cada ciclo de riego.</w:t>
       </w:r>
     </w:p>
     <w:p>
@@ -1038,7 +1038,7 @@
         <w:t xml:space="preserve"> </w:t>
       </w:r>
       <w:r>
-        <w:t xml:space="preserve">La bomba sumergible Grundfos de 5 HP extrae agua de un pozo propio a un caudal de 4.2 L/s. Una llave de paso olvidada abierta durante 2 horas fuera de su horario desperdicia aproximadamente 30.240 litros de agua (4.2 L/s × 7.200 s). SARQUE elimina este riesgo al automatizar el cierre de electroválvulas al término exacto del ciclo programado en el controlador BL-KR.</w:t>
+        <w:t xml:space="preserve">La bomba sumergible Grundfos de 5 HP extrae agua de un pozo propio a un caudal de 4 L/s. Una llave de paso olvidada abierta durante 2 horas fuera de su horario desperdicia aproximadamente 28.800 litros de agua (4 L/s × 7.200 s). SARQUE elimina este riesgo al automatizar el cierre de electroválvulas al término exacto del ciclo programado en el controlador BL-KR.</w:t>
       </w:r>
     </w:p>
     <w:p>
@@ -2881,7 +2881,7 @@
         <w:pStyle w:val="FirstParagraph"/>
       </w:pPr>
       <w:r>
-        <w:t xml:space="preserve">Donde V es el volumen en litros, Q es el caudal en L/s y t es la duración en segundos. En SARQUE, con Q = 4.2 L/s, un ciclo de riego de 2 horas (7.200 s) entrega 30.240 L por sector activo.</w:t>
+        <w:t xml:space="preserve">Donde V es el volumen en litros, Q es el caudal en L/s y t es la duración en segundos. En SARQUE, con Q = 4 L/s, un ciclo de riego de 2 horas (7.200 s) entrega 28.800 L por sector activo.</w:t>
       </w:r>
     </w:p>
     <w:p>
@@ -10486,7 +10486,7 @@
               <w:jc w:val="left"/>
             </w:pPr>
             <w:r>
-              <w:t xml:space="preserve">~4.2 L/s</w:t>
+              <w:t xml:space="preserve">~4 L/s</w:t>
             </w:r>
           </w:p>
         </w:tc>
@@ -12124,7 +12124,7 @@
         </w:numPr>
       </w:pPr>
       <w:r>
-        <w:t xml:space="preserve">La elección de la app móvil K-RainBL como interfaz principal de programación de los controladores —en lugar de un puente IoT dedicado— se justifica por la cobertura desigual de señal WiFi en el predio del parque y por la confiabilidad y simplicidad de la solución oficial del fabricante, que no requiere infraestructura adicional ni mantenimiento de firmware.</w:t>
+        <w:t xml:space="preserve">La elección de la app móvil K-RainBL como interfaz principal de programación de los controladores se justifica por la cobertura desigual de señal WiFi en el predio del parque y por la confiabilidad y simplicidad de la solución oficial del fabricante, que no requiere infraestructura adicional ni hardware complementario.</w:t>
       </w:r>
     </w:p>
     <w:p>
@@ -13094,7 +13094,7 @@
               <w:jc w:val="left"/>
             </w:pPr>
             <w:r>
-              <w:t xml:space="preserve">4.2 L/s (15.12 m³/h)</w:t>
+              <w:t xml:space="preserve">4 L/s (14.40 m³/h)</w:t>
             </w:r>
           </w:p>
         </w:tc>

</xml_diff>